<commit_message>
Focus design document on server architecture
</commit_message>
<xml_diff>
--- a/SYSTEM_DESIGN.docx
+++ b/SYSTEM_DESIGN.docx
@@ -11,7 +11,7 @@
           <w:b/>
           <w:sz w:val="36"/>
         </w:rPr>
-        <w:t>Ride Booking System — System Design &amp; Team Coordination</w:t>
+        <w:t>Ride Booking Server — System Design</w:t>
       </w:r>
     </w:p>
     <w:p>
@@ -22,7 +22,7 @@
         <w:rPr>
           <w:i/>
         </w:rPr>
-        <w:t>CS0051 Parallel and Distributed Computing</w:t>
+        <w:t>Concurrent Backend Design for Driver Availability</w:t>
       </w:r>
     </w:p>
     <w:p>
@@ -30,10 +30,10 @@
         <w:rPr>
           <w:b/>
         </w:rPr>
-        <w:t xml:space="preserve">Purpose: </w:t>
+        <w:t xml:space="preserve">Scope: </w:t>
       </w:r>
       <w:r>
-        <w:t>This document aligns the team on architecture, concurrency rules, command protocol, integration expectations, and demo responsibilities.</w:t>
+        <w:t>This document describes only the server/backend design. It intentionally omits local demo scripts, simulator setup, load-test commands, and team coordination details.</w:t>
       </w:r>
     </w:p>
     <w:p>
@@ -41,12 +41,12 @@
         <w:pStyle w:val="Heading1"/>
       </w:pPr>
       <w:r>
-        <w:t>1. Project Summary</w:t>
+        <w:t>1. Server Purpose</w:t>
       </w:r>
     </w:p>
     <w:p>
       <w:r>
-        <w:t>The system simulates a concurrent ride-booking service. Multiple passengers create ride requests, dispatcher threads match those requests to available drivers, and driver simulators accept, reject, or finish rides. The central concurrency problem is preventing two simultaneous booking operations from assigning the same driver.</w:t>
+        <w:t>The server coordinates ride booking requests and driver availability. Its main responsibility is to assign available drivers to passenger bookings without allowing two concurrent dispatchers to reserve the same driver.</w:t>
       </w:r>
     </w:p>
     <w:p>
@@ -54,7 +54,7 @@
         <w:pStyle w:val="ListBullet"/>
       </w:pPr>
       <w:r>
-        <w:t>Scenario: ride booking with shared driver availability.</w:t>
+        <w:t>Accepted scenario: ride booking with shared driver availability.</w:t>
       </w:r>
     </w:p>
     <w:p>
@@ -62,7 +62,7 @@
         <w:pStyle w:val="ListBullet"/>
       </w:pPr>
       <w:r>
-        <w:t>Concurrency problem: race condition on driver availability and booking assignment.</w:t>
+        <w:t>Concurrency problem: race condition during check-and-assign of driver availability.</w:t>
       </w:r>
     </w:p>
     <w:p>
@@ -70,7 +70,7 @@
         <w:pStyle w:val="ListBullet"/>
       </w:pPr>
       <w:r>
-        <w:t>Synchronization method: mutexes around shared state.</w:t>
+        <w:t>Correctness goal: no active driver is assigned to more than one active booking.</w:t>
       </w:r>
     </w:p>
     <w:p>
@@ -78,7 +78,7 @@
         <w:pStyle w:val="ListBullet"/>
       </w:pPr>
       <w:r>
-        <w:t>Main correctness property: no driver should be assigned to more than one active booking at the same time.</w:t>
+        <w:t>Synchronization method: mutex-protected state transitions.</w:t>
       </w:r>
     </w:p>
     <w:p>
@@ -86,114 +86,47 @@
         <w:pStyle w:val="Heading1"/>
       </w:pPr>
       <w:r>
-        <w:t>2. Goals and Non-Goals</w:t>
+        <w:t>2. High-Level Architecture</w:t>
       </w:r>
     </w:p>
-    <w:tbl>
-      <w:tblPr>
-        <w:tblStyle w:val="TableGrid"/>
-        <w:tblW w:type="auto" w:w="0"/>
-        <w:jc w:val="center"/>
-        <w:tblLook w:firstColumn="1" w:firstRow="1" w:lastColumn="0" w:lastRow="0" w:noHBand="0" w:noVBand="1" w:val="04A0"/>
-      </w:tblPr>
-      <w:tblGrid>
-        <w:gridCol w:w="5040"/>
-        <w:gridCol w:w="5040"/>
-      </w:tblGrid>
-      <w:tr>
-        <w:tc>
-          <w:tcPr>
-            <w:tcW w:type="dxa" w:w="5040"/>
-            <w:vAlign w:val="center"/>
-            <w:shd w:fill="D9EAF7"/>
-          </w:tcPr>
-          <w:p>
-            <w:r>
-              <w:rPr>
-                <w:sz w:val="20"/>
-              </w:rPr>
-            </w:r>
-            <w:r>
-              <w:rPr>
-                <w:b/>
-                <w:sz w:val="20"/>
-              </w:rPr>
-              <w:t>Goals</w:t>
-            </w:r>
-          </w:p>
-        </w:tc>
-        <w:tc>
-          <w:tcPr>
-            <w:tcW w:type="dxa" w:w="5040"/>
-            <w:vAlign w:val="center"/>
-            <w:shd w:fill="D9EAF7"/>
-          </w:tcPr>
-          <w:p>
-            <w:r>
-              <w:rPr>
-                <w:sz w:val="20"/>
-              </w:rPr>
-            </w:r>
-            <w:r>
-              <w:rPr>
-                <w:b/>
-                <w:sz w:val="20"/>
-              </w:rPr>
-              <w:t>Non-Goals</w:t>
-            </w:r>
-          </w:p>
-        </w:tc>
-      </w:tr>
-      <w:tr>
-        <w:tc>
-          <w:tcPr>
-            <w:tcW w:type="dxa" w:w="5040"/>
-            <w:vAlign w:val="center"/>
-          </w:tcPr>
-          <w:p>
-            <w:r>
-              <w:rPr>
-                <w:sz w:val="20"/>
-              </w:rPr>
-            </w:r>
-            <w:r>
-              <w:rPr>
-                <w:b w:val="0"/>
-                <w:sz w:val="20"/>
-              </w:rPr>
-              <w:t>Prevent double-booked drivers; process concurrent passenger requests; demonstrate mutex synchronization; simulate accept/reject/finish driver behavior; provide terminal demos and stress tests.</w:t>
-            </w:r>
-          </w:p>
-        </w:tc>
-        <w:tc>
-          <w:tcPr>
-            <w:tcW w:type="dxa" w:w="5040"/>
-            <w:vAlign w:val="center"/>
-          </w:tcPr>
-          <w:p>
-            <w:r>
-              <w:rPr>
-                <w:sz w:val="20"/>
-              </w:rPr>
-            </w:r>
-            <w:r>
-              <w:rPr>
-                <w:b w:val="0"/>
-                <w:sz w:val="20"/>
-              </w:rPr>
-              <w:t>No real HTTP server; no database persistence; no authentication; no real maps/routing; no production-grade networking; no payment or account system.</w:t>
-            </w:r>
-          </w:p>
-        </w:tc>
-      </w:tr>
-    </w:tbl>
-    <w:p/>
+    <w:p>
+      <w:r>
+        <w:rPr>
+          <w:rFonts w:ascii="Courier New" w:hAnsi="Courier New" w:eastAsia="Courier New"/>
+          <w:sz w:val="18"/>
+        </w:rPr>
+        <w:t>TCP Command Handler</w:t>
+        <w:br/>
+        <w:t xml:space="preserve">        |</w:t>
+        <w:br/>
+        <w:t xml:space="preserve">        v</w:t>
+        <w:br/>
+        <w:t>Booking Registry &lt;-&gt; Booking Queue -&gt; Dispatcher Threads</w:t>
+        <w:br/>
+        <w:t xml:space="preserve">        ^                         |</w:t>
+        <w:br/>
+        <w:t xml:space="preserve">        |                         v</w:t>
+        <w:br/>
+        <w:t xml:space="preserve">        +-----------------&gt; Driver Registry</w:t>
+        <w:br/>
+        <w:t xml:space="preserve">                                  ^</w:t>
+        <w:br/>
+        <w:t xml:space="preserve">                                  |</w:t>
+        <w:br/>
+        <w:t xml:space="preserve">                            Monitor Actor</w:t>
+      </w:r>
+    </w:p>
+    <w:p>
+      <w:r>
+        <w:t>The backend is composed of registries, a thread-safe queue, dispatcher worker threads, a timeout monitor, and a simple TCP command handler. Registries own the long-lived driver and booking records. Dispatchers perform matching. The monitor releases stale reservations.</w:t>
+      </w:r>
+    </w:p>
     <w:p>
       <w:pPr>
         <w:pStyle w:val="Heading1"/>
       </w:pPr>
       <w:r>
-        <w:t>3. Architecture Overview</w:t>
+        <w:t>3. Core Data Models</w:t>
       </w:r>
     </w:p>
     <w:tbl>
@@ -216,17 +149,13 @@
             <w:shd w:fill="D9EAF7"/>
           </w:tcPr>
           <w:p>
-            <w:r>
-              <w:rPr>
-                <w:sz w:val="20"/>
-              </w:rPr>
-            </w:r>
+            <w:r/>
             <w:r>
               <w:rPr>
                 <w:b/>
                 <w:sz w:val="20"/>
               </w:rPr>
-              <w:t>Component</w:t>
+              <w:t>Model</w:t>
             </w:r>
           </w:p>
         </w:tc>
@@ -237,17 +166,13 @@
             <w:shd w:fill="D9EAF7"/>
           </w:tcPr>
           <w:p>
-            <w:r>
-              <w:rPr>
-                <w:sz w:val="20"/>
-              </w:rPr>
-            </w:r>
+            <w:r/>
             <w:r>
               <w:rPr>
                 <w:b/>
                 <w:sz w:val="20"/>
               </w:rPr>
-              <w:t>File</w:t>
+              <w:t>Important fields</w:t>
             </w:r>
           </w:p>
         </w:tc>
@@ -258,17 +183,13 @@
             <w:shd w:fill="D9EAF7"/>
           </w:tcPr>
           <w:p>
-            <w:r>
-              <w:rPr>
-                <w:sz w:val="20"/>
-              </w:rPr>
-            </w:r>
+            <w:r/>
             <w:r>
               <w:rPr>
                 <w:b/>
                 <w:sz w:val="20"/>
               </w:rPr>
-              <w:t>Role</w:t>
+              <w:t>Purpose</w:t>
             </w:r>
           </w:p>
         </w:tc>
@@ -280,17 +201,13 @@
             <w:vAlign w:val="center"/>
           </w:tcPr>
           <w:p>
-            <w:r>
-              <w:rPr>
-                <w:sz w:val="20"/>
-              </w:rPr>
-            </w:r>
+            <w:r/>
             <w:r>
               <w:rPr>
                 <w:b w:val="0"/>
                 <w:sz w:val="20"/>
               </w:rPr>
-              <w:t>Backend</w:t>
+              <w:t>Driver</w:t>
             </w:r>
           </w:p>
         </w:tc>
@@ -300,17 +217,13 @@
             <w:vAlign w:val="center"/>
           </w:tcPr>
           <w:p>
-            <w:r>
-              <w:rPr>
-                <w:sz w:val="20"/>
-              </w:rPr>
-            </w:r>
+            <w:r/>
             <w:r>
               <w:rPr>
                 <w:b w:val="0"/>
                 <w:sz w:val="20"/>
               </w:rPr>
-              <w:t>main.cpp</w:t>
+              <w:t>driver_id, state, booking_id, offer_start_time, pos, mtx</w:t>
             </w:r>
           </w:p>
         </w:tc>
@@ -320,17 +233,13 @@
             <w:vAlign w:val="center"/>
           </w:tcPr>
           <w:p>
-            <w:r>
-              <w:rPr>
-                <w:sz w:val="20"/>
-              </w:rPr>
-            </w:r>
+            <w:r/>
             <w:r>
               <w:rPr>
                 <w:b w:val="0"/>
                 <w:sz w:val="20"/>
               </w:rPr>
-              <w:t>Concurrency engine, registries, dispatcher threads, monitor actor, TCP command handler.</w:t>
+              <w:t>Represents a driver and protects driver-specific assignment state.</w:t>
             </w:r>
           </w:p>
         </w:tc>
@@ -342,17 +251,13 @@
             <w:vAlign w:val="center"/>
           </w:tcPr>
           <w:p>
-            <w:r>
-              <w:rPr>
-                <w:sz w:val="20"/>
-              </w:rPr>
-            </w:r>
+            <w:r/>
             <w:r>
               <w:rPr>
                 <w:b w:val="0"/>
                 <w:sz w:val="20"/>
               </w:rPr>
-              <w:t>Passenger simulator</w:t>
+              <w:t>Booking</w:t>
             </w:r>
           </w:p>
         </w:tc>
@@ -362,17 +267,13 @@
             <w:vAlign w:val="center"/>
           </w:tcPr>
           <w:p>
-            <w:r>
-              <w:rPr>
-                <w:sz w:val="20"/>
-              </w:rPr>
-            </w:r>
+            <w:r/>
             <w:r>
               <w:rPr>
                 <w:b w:val="0"/>
                 <w:sz w:val="20"/>
               </w:rPr>
-              <w:t>simulate_user.cpp</w:t>
+              <w:t>booking_id, state, driver_id, retry_count, pickup, destination, mtx</w:t>
             </w:r>
           </w:p>
         </w:tc>
@@ -382,17 +283,13 @@
             <w:vAlign w:val="center"/>
           </w:tcPr>
           <w:p>
-            <w:r>
-              <w:rPr>
-                <w:sz w:val="20"/>
-              </w:rPr>
-            </w:r>
+            <w:r/>
             <w:r>
               <w:rPr>
                 <w:b w:val="0"/>
                 <w:sz w:val="20"/>
               </w:rPr>
-              <w:t>Creates bookings and polls booking state with terminal display.</w:t>
+              <w:t>Represents a passenger ride request and protects booking-specific lifecycle state.</w:t>
             </w:r>
           </w:p>
         </w:tc>
@@ -404,17 +301,13 @@
             <w:vAlign w:val="center"/>
           </w:tcPr>
           <w:p>
-            <w:r>
-              <w:rPr>
-                <w:sz w:val="20"/>
-              </w:rPr>
-            </w:r>
+            <w:r/>
             <w:r>
               <w:rPr>
                 <w:b w:val="0"/>
                 <w:sz w:val="20"/>
               </w:rPr>
-              <w:t>Driver simulator</w:t>
+              <w:t>BookingQueue</w:t>
             </w:r>
           </w:p>
         </w:tc>
@@ -424,17 +317,13 @@
             <w:vAlign w:val="center"/>
           </w:tcPr>
           <w:p>
-            <w:r>
-              <w:rPr>
-                <w:sz w:val="20"/>
-              </w:rPr>
-            </w:r>
+            <w:r/>
             <w:r>
               <w:rPr>
                 <w:b w:val="0"/>
                 <w:sz w:val="20"/>
               </w:rPr>
-              <w:t>simulate_driver.cpp</w:t>
+              <w:t>queue&lt;int&gt;, mtx</w:t>
             </w:r>
           </w:p>
         </w:tc>
@@ -444,17 +333,13 @@
             <w:vAlign w:val="center"/>
           </w:tcPr>
           <w:p>
-            <w:r>
-              <w:rPr>
-                <w:sz w:val="20"/>
-              </w:rPr>
-            </w:r>
+            <w:r/>
             <w:r>
               <w:rPr>
                 <w:b w:val="0"/>
                 <w:sz w:val="20"/>
               </w:rPr>
-              <w:t>Displays all drivers and automatically accepts/rejects/finishes rides.</w:t>
+              <w:t>Stores queued booking IDs for dispatcher threads.</w:t>
             </w:r>
           </w:p>
         </w:tc>
@@ -466,17 +351,13 @@
             <w:vAlign w:val="center"/>
           </w:tcPr>
           <w:p>
-            <w:r>
-              <w:rPr>
-                <w:sz w:val="20"/>
-              </w:rPr>
-            </w:r>
+            <w:r/>
             <w:r>
               <w:rPr>
                 <w:b w:val="0"/>
                 <w:sz w:val="20"/>
               </w:rPr>
-              <w:t>Load test</w:t>
+              <w:t>BookingRegistry</w:t>
             </w:r>
           </w:p>
         </w:tc>
@@ -486,17 +367,13 @@
             <w:vAlign w:val="center"/>
           </w:tcPr>
           <w:p>
-            <w:r>
-              <w:rPr>
-                <w:sz w:val="20"/>
-              </w:rPr>
-            </w:r>
+            <w:r/>
             <w:r>
               <w:rPr>
                 <w:b w:val="0"/>
                 <w:sz w:val="20"/>
               </w:rPr>
-              <w:t>loadtest.cpp / loadtest.sh</w:t>
+              <w:t>map&lt;int, unique_ptr&lt;Booking&gt;&gt;, mtx</w:t>
             </w:r>
           </w:p>
         </w:tc>
@@ -506,17 +383,13 @@
             <w:vAlign w:val="center"/>
           </w:tcPr>
           <w:p>
-            <w:r>
-              <w:rPr>
-                <w:sz w:val="20"/>
-              </w:rPr>
-            </w:r>
+            <w:r/>
             <w:r>
               <w:rPr>
                 <w:b w:val="0"/>
                 <w:sz w:val="20"/>
               </w:rPr>
-              <w:t>Creates many booking requests to stress the backend.</w:t>
+              <w:t>Owns all booking records and provides lookup by ID.</w:t>
             </w:r>
           </w:p>
         </w:tc>
@@ -528,17 +401,13 @@
             <w:vAlign w:val="center"/>
           </w:tcPr>
           <w:p>
-            <w:r>
-              <w:rPr>
-                <w:sz w:val="20"/>
-              </w:rPr>
-            </w:r>
+            <w:r/>
             <w:r>
               <w:rPr>
                 <w:b w:val="0"/>
                 <w:sz w:val="20"/>
               </w:rPr>
-              <w:t>Correctness monitor</w:t>
+              <w:t>DriverRegistry</w:t>
             </w:r>
           </w:p>
         </w:tc>
@@ -548,17 +417,13 @@
             <w:vAlign w:val="center"/>
           </w:tcPr>
           <w:p>
-            <w:r>
-              <w:rPr>
-                <w:sz w:val="20"/>
-              </w:rPr>
-            </w:r>
+            <w:r/>
             <w:r>
               <w:rPr>
                 <w:b w:val="0"/>
                 <w:sz w:val="20"/>
               </w:rPr>
-              <w:t>check_double_booking.sh</w:t>
+              <w:t>map&lt;int, unique_ptr&lt;Driver&gt;&gt;, mtx</w:t>
             </w:r>
           </w:p>
         </w:tc>
@@ -568,17 +433,88 @@
             <w:vAlign w:val="center"/>
           </w:tcPr>
           <w:p>
-            <w:r>
-              <w:rPr>
-                <w:sz w:val="20"/>
-              </w:rPr>
-            </w:r>
+            <w:r/>
             <w:r>
               <w:rPr>
                 <w:b w:val="0"/>
                 <w:sz w:val="20"/>
               </w:rPr>
-              <w:t>Polls active bookings and reports duplicate driver assignments.</w:t>
+              <w:t>Owns all driver records and provides lookup plus nearest-driver search.</w:t>
+            </w:r>
+          </w:p>
+        </w:tc>
+      </w:tr>
+    </w:tbl>
+    <w:p/>
+    <w:p>
+      <w:pPr>
+        <w:pStyle w:val="Heading1"/>
+      </w:pPr>
+      <w:r>
+        <w:t>4. Thread Model</w:t>
+      </w:r>
+    </w:p>
+    <w:tbl>
+      <w:tblPr>
+        <w:tblStyle w:val="TableGrid"/>
+        <w:tblW w:type="auto" w:w="0"/>
+        <w:jc w:val="center"/>
+        <w:tblLook w:firstColumn="1" w:firstRow="1" w:lastColumn="0" w:lastRow="0" w:noHBand="0" w:noVBand="1" w:val="04A0"/>
+      </w:tblPr>
+      <w:tblGrid>
+        <w:gridCol w:w="3360"/>
+        <w:gridCol w:w="3360"/>
+        <w:gridCol w:w="3360"/>
+      </w:tblGrid>
+      <w:tr>
+        <w:tc>
+          <w:tcPr>
+            <w:tcW w:type="dxa" w:w="3360"/>
+            <w:vAlign w:val="center"/>
+            <w:shd w:fill="D9EAF7"/>
+          </w:tcPr>
+          <w:p>
+            <w:r/>
+            <w:r>
+              <w:rPr>
+                <w:b/>
+                <w:sz w:val="20"/>
+              </w:rPr>
+              <w:t>Thread / Actor</w:t>
+            </w:r>
+          </w:p>
+        </w:tc>
+        <w:tc>
+          <w:tcPr>
+            <w:tcW w:type="dxa" w:w="3360"/>
+            <w:vAlign w:val="center"/>
+            <w:shd w:fill="D9EAF7"/>
+          </w:tcPr>
+          <w:p>
+            <w:r/>
+            <w:r>
+              <w:rPr>
+                <w:b/>
+                <w:sz w:val="20"/>
+              </w:rPr>
+              <w:t>Count</w:t>
+            </w:r>
+          </w:p>
+        </w:tc>
+        <w:tc>
+          <w:tcPr>
+            <w:tcW w:type="dxa" w:w="3360"/>
+            <w:vAlign w:val="center"/>
+            <w:shd w:fill="D9EAF7"/>
+          </w:tcPr>
+          <w:p>
+            <w:r/>
+            <w:r>
+              <w:rPr>
+                <w:b/>
+                <w:sz w:val="20"/>
+              </w:rPr>
+              <w:t>Responsibility</w:t>
             </w:r>
           </w:p>
         </w:tc>
@@ -590,17 +526,13 @@
             <w:vAlign w:val="center"/>
           </w:tcPr>
           <w:p>
-            <w:r>
-              <w:rPr>
-                <w:sz w:val="20"/>
-              </w:rPr>
-            </w:r>
+            <w:r/>
             <w:r>
               <w:rPr>
                 <w:b w:val="0"/>
                 <w:sz w:val="20"/>
               </w:rPr>
-              <w:t>Launcher</w:t>
+              <w:t>Dispatcher threads</w:t>
             </w:r>
           </w:p>
         </w:tc>
@@ -610,17 +542,13 @@
             <w:vAlign w:val="center"/>
           </w:tcPr>
           <w:p>
-            <w:r>
-              <w:rPr>
-                <w:sz w:val="20"/>
-              </w:rPr>
-            </w:r>
+            <w:r/>
             <w:r>
               <w:rPr>
                 <w:b w:val="0"/>
                 <w:sz w:val="20"/>
               </w:rPr>
-              <w:t>run_backend.sh</w:t>
+              <w:t>4</w:t>
             </w:r>
           </w:p>
         </w:tc>
@@ -630,17 +558,113 @@
             <w:vAlign w:val="center"/>
           </w:tcPr>
           <w:p>
-            <w:r>
-              <w:rPr>
-                <w:sz w:val="20"/>
-              </w:rPr>
-            </w:r>
+            <w:r/>
             <w:r>
               <w:rPr>
                 <w:b w:val="0"/>
                 <w:sz w:val="20"/>
               </w:rPr>
-              <w:t>Compiles and starts the backend.</w:t>
+              <w:t>Pop booking IDs, transition bookings to MATCHING, find and reserve available drivers.</w:t>
+            </w:r>
+          </w:p>
+        </w:tc>
+      </w:tr>
+      <w:tr>
+        <w:tc>
+          <w:tcPr>
+            <w:tcW w:type="dxa" w:w="3360"/>
+            <w:vAlign w:val="center"/>
+          </w:tcPr>
+          <w:p>
+            <w:r/>
+            <w:r>
+              <w:rPr>
+                <w:b w:val="0"/>
+                <w:sz w:val="20"/>
+              </w:rPr>
+              <w:t>Monitor actor</w:t>
+            </w:r>
+          </w:p>
+        </w:tc>
+        <w:tc>
+          <w:tcPr>
+            <w:tcW w:type="dxa" w:w="3360"/>
+            <w:vAlign w:val="center"/>
+          </w:tcPr>
+          <w:p>
+            <w:r/>
+            <w:r>
+              <w:rPr>
+                <w:b w:val="0"/>
+                <w:sz w:val="20"/>
+              </w:rPr>
+              <w:t>1</w:t>
+            </w:r>
+          </w:p>
+        </w:tc>
+        <w:tc>
+          <w:tcPr>
+            <w:tcW w:type="dxa" w:w="3360"/>
+            <w:vAlign w:val="center"/>
+          </w:tcPr>
+          <w:p>
+            <w:r/>
+            <w:r>
+              <w:rPr>
+                <w:b w:val="0"/>
+                <w:sz w:val="20"/>
+              </w:rPr>
+              <w:t>Scans RESERVED drivers, expires timed-out offers, and requeues or fails bookings.</w:t>
+            </w:r>
+          </w:p>
+        </w:tc>
+      </w:tr>
+      <w:tr>
+        <w:tc>
+          <w:tcPr>
+            <w:tcW w:type="dxa" w:w="3360"/>
+            <w:vAlign w:val="center"/>
+          </w:tcPr>
+          <w:p>
+            <w:r/>
+            <w:r>
+              <w:rPr>
+                <w:b w:val="0"/>
+                <w:sz w:val="20"/>
+              </w:rPr>
+              <w:t>Socket command handler</w:t>
+            </w:r>
+          </w:p>
+        </w:tc>
+        <w:tc>
+          <w:tcPr>
+            <w:tcW w:type="dxa" w:w="3360"/>
+            <w:vAlign w:val="center"/>
+          </w:tcPr>
+          <w:p>
+            <w:r/>
+            <w:r>
+              <w:rPr>
+                <w:b w:val="0"/>
+                <w:sz w:val="20"/>
+              </w:rPr>
+              <w:t>1</w:t>
+            </w:r>
+          </w:p>
+        </w:tc>
+        <w:tc>
+          <w:tcPr>
+            <w:tcW w:type="dxa" w:w="3360"/>
+            <w:vAlign w:val="center"/>
+          </w:tcPr>
+          <w:p>
+            <w:r/>
+            <w:r>
+              <w:rPr>
+                <w:b w:val="0"/>
+                <w:sz w:val="20"/>
+              </w:rPr>
+              <w:t>Accepts TCP connections and dispatches text commands to backend operations.</w:t>
             </w:r>
           </w:p>
         </w:tc>
@@ -649,22 +673,7 @@
     <w:p/>
     <w:p>
       <w:r>
-        <w:rPr>
-          <w:rFonts w:ascii="Courier New" w:hAnsi="Courier New" w:eastAsia="Courier New"/>
-          <w:sz w:val="18"/>
-        </w:rPr>
-        <w:t>Passengers -&gt; BOOK command -&gt; BookingQueue -&gt; Dispatcher Threads -&gt; DriverRegistry</w:t>
-        <w:br/>
-        <w:t xml:space="preserve">                                      |</w:t>
-        <w:br/>
-        <w:t xml:space="preserve">                                      v</w:t>
-        <w:br/>
-        <w:t xml:space="preserve">                                BookingRegistry</w:t>
-        <w:br/>
-        <w:br/>
-        <w:t>Driver Simulator -&gt; ACCEPT / REJECT / FINISH</w:t>
-        <w:br/>
-        <w:t>Monitor Actor -&gt; expires timed-out RESERVED drivers</w:t>
+        <w:t>The network command handler is single-threaded. Concurrency inside the server primarily occurs in the dispatcher threads and monitor actor, which operate on shared booking and driver state.</w:t>
       </w:r>
     </w:p>
     <w:p>
@@ -672,63 +681,7 @@
         <w:pStyle w:val="Heading1"/>
       </w:pPr>
       <w:r>
-        <w:t>4. Thread Model</w:t>
-      </w:r>
-    </w:p>
-    <w:p>
-      <w:pPr>
-        <w:pStyle w:val="ListBullet"/>
-      </w:pPr>
-      <w:r>
-        <w:t>Backend starts 4 dispatcher threads. Each dispatcher dequeues booking IDs and attempts to reserve an available driver.</w:t>
-      </w:r>
-    </w:p>
-    <w:p>
-      <w:pPr>
-        <w:pStyle w:val="ListBullet"/>
-      </w:pPr>
-      <w:r>
-        <w:t>Backend starts 1 monitor actor. It scans RESERVED drivers and expires offers after the confirmation timeout.</w:t>
-      </w:r>
-    </w:p>
-    <w:p>
-      <w:pPr>
-        <w:pStyle w:val="ListBullet"/>
-      </w:pPr>
-      <w:r>
-        <w:t>Backend has 1 socket command handler. It accepts one command per TCP connection.</w:t>
-      </w:r>
-    </w:p>
-    <w:p>
-      <w:pPr>
-        <w:pStyle w:val="ListBullet"/>
-      </w:pPr>
-      <w:r>
-        <w:t>Passenger simulator creates multiple passenger threads.</w:t>
-      </w:r>
-    </w:p>
-    <w:p>
-      <w:pPr>
-        <w:pStyle w:val="ListBullet"/>
-      </w:pPr>
-      <w:r>
-        <w:t>Driver simulator creates one thread per driver returned by DRIVERS.</w:t>
-      </w:r>
-    </w:p>
-    <w:p>
-      <w:pPr>
-        <w:pStyle w:val="ListBullet"/>
-      </w:pPr>
-      <w:r>
-        <w:t>Important limitation: command handling is single-threaded, but booking matching is concurrent through the dispatcher threads.</w:t>
-      </w:r>
-    </w:p>
-    <w:p>
-      <w:pPr>
-        <w:pStyle w:val="Heading1"/>
-      </w:pPr>
-      <w:r>
-        <w:t>5. Shared Resources and Mutexes</w:t>
+        <w:t>5. Shared State and Synchronization</w:t>
       </w:r>
     </w:p>
     <w:tbl>
@@ -750,17 +703,13 @@
             <w:shd w:fill="D9EAF7"/>
           </w:tcPr>
           <w:p>
-            <w:r>
-              <w:rPr>
-                <w:sz w:val="20"/>
-              </w:rPr>
-            </w:r>
+            <w:r/>
             <w:r>
               <w:rPr>
                 <w:b/>
                 <w:sz w:val="20"/>
               </w:rPr>
-              <w:t>Shared resource</w:t>
+              <w:t>Shared state</w:t>
             </w:r>
           </w:p>
         </w:tc>
@@ -771,17 +720,13 @@
             <w:shd w:fill="D9EAF7"/>
           </w:tcPr>
           <w:p>
-            <w:r>
-              <w:rPr>
-                <w:sz w:val="20"/>
-              </w:rPr>
-            </w:r>
+            <w:r/>
             <w:r>
               <w:rPr>
                 <w:b/>
                 <w:sz w:val="20"/>
               </w:rPr>
-              <w:t>Protected by</w:t>
+              <w:t>Mutex</w:t>
             </w:r>
           </w:p>
         </w:tc>
@@ -793,17 +738,13 @@
             <w:vAlign w:val="center"/>
           </w:tcPr>
           <w:p>
-            <w:r>
-              <w:rPr>
-                <w:sz w:val="20"/>
-              </w:rPr>
-            </w:r>
+            <w:r/>
             <w:r>
               <w:rPr>
                 <w:b w:val="0"/>
                 <w:sz w:val="20"/>
               </w:rPr>
-              <w:t>BookingQueue::q</w:t>
+              <w:t>Booking queue contents</w:t>
             </w:r>
           </w:p>
         </w:tc>
@@ -813,11 +754,7 @@
             <w:vAlign w:val="center"/>
           </w:tcPr>
           <w:p>
-            <w:r>
-              <w:rPr>
-                <w:sz w:val="20"/>
-              </w:rPr>
-            </w:r>
+            <w:r/>
             <w:r>
               <w:rPr>
                 <w:b w:val="0"/>
@@ -835,17 +772,13 @@
             <w:vAlign w:val="center"/>
           </w:tcPr>
           <w:p>
-            <w:r>
-              <w:rPr>
-                <w:sz w:val="20"/>
-              </w:rPr>
-            </w:r>
+            <w:r/>
             <w:r>
               <w:rPr>
                 <w:b w:val="0"/>
                 <w:sz w:val="20"/>
               </w:rPr>
-              <w:t>BookingRegistry::bookings</w:t>
+              <w:t>Booking registry map</w:t>
             </w:r>
           </w:p>
         </w:tc>
@@ -855,11 +788,7 @@
             <w:vAlign w:val="center"/>
           </w:tcPr>
           <w:p>
-            <w:r>
-              <w:rPr>
-                <w:sz w:val="20"/>
-              </w:rPr>
-            </w:r>
+            <w:r/>
             <w:r>
               <w:rPr>
                 <w:b w:val="0"/>
@@ -877,17 +806,13 @@
             <w:vAlign w:val="center"/>
           </w:tcPr>
           <w:p>
-            <w:r>
-              <w:rPr>
-                <w:sz w:val="20"/>
-              </w:rPr>
-            </w:r>
+            <w:r/>
             <w:r>
               <w:rPr>
                 <w:b w:val="0"/>
                 <w:sz w:val="20"/>
               </w:rPr>
-              <w:t>Individual Booking fields: state, driver_id, retry_count, pickup, destination</w:t>
+              <w:t>Individual booking lifecycle fields</w:t>
             </w:r>
           </w:p>
         </w:tc>
@@ -897,11 +822,7 @@
             <w:vAlign w:val="center"/>
           </w:tcPr>
           <w:p>
-            <w:r>
-              <w:rPr>
-                <w:sz w:val="20"/>
-              </w:rPr>
-            </w:r>
+            <w:r/>
             <w:r>
               <w:rPr>
                 <w:b w:val="0"/>
@@ -919,17 +840,13 @@
             <w:vAlign w:val="center"/>
           </w:tcPr>
           <w:p>
-            <w:r>
-              <w:rPr>
-                <w:sz w:val="20"/>
-              </w:rPr>
-            </w:r>
+            <w:r/>
             <w:r>
               <w:rPr>
                 <w:b w:val="0"/>
                 <w:sz w:val="20"/>
               </w:rPr>
-              <w:t>DriverRegistry::drivers</w:t>
+              <w:t>Driver registry map</w:t>
             </w:r>
           </w:p>
         </w:tc>
@@ -939,11 +856,7 @@
             <w:vAlign w:val="center"/>
           </w:tcPr>
           <w:p>
-            <w:r>
-              <w:rPr>
-                <w:sz w:val="20"/>
-              </w:rPr>
-            </w:r>
+            <w:r/>
             <w:r>
               <w:rPr>
                 <w:b w:val="0"/>
@@ -961,17 +874,13 @@
             <w:vAlign w:val="center"/>
           </w:tcPr>
           <w:p>
-            <w:r>
-              <w:rPr>
-                <w:sz w:val="20"/>
-              </w:rPr>
-            </w:r>
+            <w:r/>
             <w:r>
               <w:rPr>
                 <w:b w:val="0"/>
                 <w:sz w:val="20"/>
               </w:rPr>
-              <w:t>Individual Driver fields: state, booking_id, pos, offer_start_time</w:t>
+              <w:t>Individual driver assignment fields</w:t>
             </w:r>
           </w:p>
         </w:tc>
@@ -981,11 +890,7 @@
             <w:vAlign w:val="center"/>
           </w:tcPr>
           <w:p>
-            <w:r>
-              <w:rPr>
-                <w:sz w:val="20"/>
-              </w:rPr>
-            </w:r>
+            <w:r/>
             <w:r>
               <w:rPr>
                 <w:b w:val="0"/>
@@ -1003,17 +908,13 @@
             <w:vAlign w:val="center"/>
           </w:tcPr>
           <w:p>
-            <w:r>
-              <w:rPr>
-                <w:sz w:val="20"/>
-              </w:rPr>
-            </w:r>
+            <w:r/>
             <w:r>
               <w:rPr>
                 <w:b w:val="0"/>
                 <w:sz w:val="20"/>
               </w:rPr>
-              <w:t>next_booking_id</w:t>
+              <w:t>Next booking ID counter</w:t>
             </w:r>
           </w:p>
         </w:tc>
@@ -1023,11 +924,7 @@
             <w:vAlign w:val="center"/>
           </w:tcPr>
           <w:p>
-            <w:r>
-              <w:rPr>
-                <w:sz w:val="20"/>
-              </w:rPr>
-            </w:r>
+            <w:r/>
             <w:r>
               <w:rPr>
                 <w:b w:val="0"/>
@@ -1045,11 +942,7 @@
             <w:vAlign w:val="center"/>
           </w:tcPr>
           <w:p>
-            <w:r>
-              <w:rPr>
-                <w:sz w:val="20"/>
-              </w:rPr>
-            </w:r>
+            <w:r/>
             <w:r>
               <w:rPr>
                 <w:b w:val="0"/>
@@ -1065,11 +958,7 @@
             <w:vAlign w:val="center"/>
           </w:tcPr>
           <w:p>
-            <w:r>
-              <w:rPr>
-                <w:sz w:val="20"/>
-              </w:rPr>
-            </w:r>
+            <w:r/>
             <w:r>
               <w:rPr>
                 <w:b w:val="0"/>
@@ -1087,7 +976,7 @@
         <w:pStyle w:val="Heading1"/>
       </w:pPr>
       <w:r>
-        <w:t>6. Locking Rules and Invariants</w:t>
+        <w:t>6. Locking Discipline</w:t>
       </w:r>
     </w:p>
     <w:p>
@@ -1102,11 +991,8 @@
       </w:r>
     </w:p>
     <w:p>
-      <w:pPr>
-        <w:pStyle w:val="ListBullet"/>
-      </w:pPr>
       <w:r>
-        <w:t>A driver can have at most one active booking_id.</w:t>
+        <w:t>This order prevents deadlocks when an operation must coordinate driver state with booking state. The driver lock is acquired first because driver availability is the scarce resource being protected from double booking.</w:t>
       </w:r>
     </w:p>
     <w:p>
@@ -1114,7 +1000,7 @@
         <w:pStyle w:val="ListBullet"/>
       </w:pPr>
       <w:r>
-        <w:t>A booking can be assigned to at most one driver.</w:t>
+        <w:t>Never update a Driver state field without holding Driver::mtx.</w:t>
       </w:r>
     </w:p>
     <w:p>
@@ -1122,7 +1008,7 @@
         <w:pStyle w:val="ListBullet"/>
       </w:pPr>
       <w:r>
-        <w:t>AVAILABLE drivers must have booking_id == -1.</w:t>
+        <w:t>Never update a Booking state field without holding Booking::mtx.</w:t>
       </w:r>
     </w:p>
     <w:p>
@@ -1130,7 +1016,7 @@
         <w:pStyle w:val="ListBullet"/>
       </w:pPr>
       <w:r>
-        <w:t>RESERVED drivers must have a valid booking_id and an offer_start_time.</w:t>
+        <w:t>Do not acquire Booking::mtx and then try to acquire Driver::mtx.</w:t>
       </w:r>
     </w:p>
     <w:p>
@@ -1138,7 +1024,7 @@
         <w:pStyle w:val="ListBullet"/>
       </w:pPr>
       <w:r>
-        <w:t>BOOKED drivers must have a valid booking_id.</w:t>
+        <w:t>Registry mutexes protect container access, not the full lifetime of object state reads/writes.</w:t>
       </w:r>
     </w:p>
     <w:p>
@@ -1146,15 +1032,7 @@
         <w:pStyle w:val="ListBullet"/>
       </w:pPr>
       <w:r>
-        <w:t>COMPLETED and FAILED bookings are terminal and must not be requeued.</w:t>
-      </w:r>
-    </w:p>
-    <w:p>
-      <w:pPr>
-        <w:pStyle w:val="ListBullet"/>
-      </w:pPr>
-      <w:r>
-        <w:t>Any code that changes driver or booking state must hold the relevant object mutex.</w:t>
+        <w:t>Operations touching both a driver and booking must validate both states while holding the relevant locks.</w:t>
       </w:r>
     </w:p>
     <w:p>
@@ -1162,7 +1040,7 @@
         <w:pStyle w:val="Heading1"/>
       </w:pPr>
       <w:r>
-        <w:t>7. Booking Lifecycle</w:t>
+        <w:t>7. Booking State Machine</w:t>
       </w:r>
     </w:p>
     <w:p>
@@ -1199,11 +1077,7 @@
             <w:shd w:fill="D9EAF7"/>
           </w:tcPr>
           <w:p>
-            <w:r>
-              <w:rPr>
-                <w:sz w:val="20"/>
-              </w:rPr>
-            </w:r>
+            <w:r/>
             <w:r>
               <w:rPr>
                 <w:b/>
@@ -1220,11 +1094,7 @@
             <w:shd w:fill="D9EAF7"/>
           </w:tcPr>
           <w:p>
-            <w:r>
-              <w:rPr>
-                <w:sz w:val="20"/>
-              </w:rPr>
-            </w:r>
+            <w:r/>
             <w:r>
               <w:rPr>
                 <w:b/>
@@ -1242,11 +1112,7 @@
             <w:vAlign w:val="center"/>
           </w:tcPr>
           <w:p>
-            <w:r>
-              <w:rPr>
-                <w:sz w:val="20"/>
-              </w:rPr>
-            </w:r>
+            <w:r/>
             <w:r>
               <w:rPr>
                 <w:b w:val="0"/>
@@ -1262,17 +1128,13 @@
             <w:vAlign w:val="center"/>
           </w:tcPr>
           <w:p>
-            <w:r>
-              <w:rPr>
-                <w:sz w:val="20"/>
-              </w:rPr>
-            </w:r>
+            <w:r/>
             <w:r>
               <w:rPr>
                 <w:b w:val="0"/>
                 <w:sz w:val="20"/>
               </w:rPr>
-              <w:t>Booking is waiting in the queue.</w:t>
+              <w:t>Booking is waiting to be processed by a dispatcher.</w:t>
             </w:r>
           </w:p>
         </w:tc>
@@ -1284,11 +1146,7 @@
             <w:vAlign w:val="center"/>
           </w:tcPr>
           <w:p>
-            <w:r>
-              <w:rPr>
-                <w:sz w:val="20"/>
-              </w:rPr>
-            </w:r>
+            <w:r/>
             <w:r>
               <w:rPr>
                 <w:b w:val="0"/>
@@ -1304,17 +1162,13 @@
             <w:vAlign w:val="center"/>
           </w:tcPr>
           <w:p>
-            <w:r>
-              <w:rPr>
-                <w:sz w:val="20"/>
-              </w:rPr>
-            </w:r>
+            <w:r/>
             <w:r>
               <w:rPr>
                 <w:b w:val="0"/>
                 <w:sz w:val="20"/>
               </w:rPr>
-              <w:t>A dispatcher is searching for an available driver.</w:t>
+              <w:t>A dispatcher is actively searching for a driver.</w:t>
             </w:r>
           </w:p>
         </w:tc>
@@ -1326,11 +1180,7 @@
             <w:vAlign w:val="center"/>
           </w:tcPr>
           <w:p>
-            <w:r>
-              <w:rPr>
-                <w:sz w:val="20"/>
-              </w:rPr>
-            </w:r>
+            <w:r/>
             <w:r>
               <w:rPr>
                 <w:b w:val="0"/>
@@ -1346,17 +1196,13 @@
             <w:vAlign w:val="center"/>
           </w:tcPr>
           <w:p>
-            <w:r>
-              <w:rPr>
-                <w:sz w:val="20"/>
-              </w:rPr>
-            </w:r>
+            <w:r/>
             <w:r>
               <w:rPr>
                 <w:b w:val="0"/>
                 <w:sz w:val="20"/>
               </w:rPr>
-              <w:t>A driver has been reserved; waiting for accept/reject/timeout.</w:t>
+              <w:t>A driver has been reserved and the server is waiting for confirmation.</w:t>
             </w:r>
           </w:p>
         </w:tc>
@@ -1368,11 +1214,7 @@
             <w:vAlign w:val="center"/>
           </w:tcPr>
           <w:p>
-            <w:r>
-              <w:rPr>
-                <w:sz w:val="20"/>
-              </w:rPr>
-            </w:r>
+            <w:r/>
             <w:r>
               <w:rPr>
                 <w:b w:val="0"/>
@@ -1388,17 +1230,13 @@
             <w:vAlign w:val="center"/>
           </w:tcPr>
           <w:p>
-            <w:r>
-              <w:rPr>
-                <w:sz w:val="20"/>
-              </w:rPr>
-            </w:r>
+            <w:r/>
             <w:r>
               <w:rPr>
                 <w:b w:val="0"/>
                 <w:sz w:val="20"/>
               </w:rPr>
-              <w:t>Driver accepted the ride.</w:t>
+              <w:t>The driver accepted the ride.</w:t>
             </w:r>
           </w:p>
         </w:tc>
@@ -1410,11 +1248,7 @@
             <w:vAlign w:val="center"/>
           </w:tcPr>
           <w:p>
-            <w:r>
-              <w:rPr>
-                <w:sz w:val="20"/>
-              </w:rPr>
-            </w:r>
+            <w:r/>
             <w:r>
               <w:rPr>
                 <w:b w:val="0"/>
@@ -1430,17 +1264,13 @@
             <w:vAlign w:val="center"/>
           </w:tcPr>
           <w:p>
-            <w:r>
-              <w:rPr>
-                <w:sz w:val="20"/>
-              </w:rPr>
-            </w:r>
+            <w:r/>
             <w:r>
               <w:rPr>
                 <w:b w:val="0"/>
                 <w:sz w:val="20"/>
               </w:rPr>
-              <w:t>Ride finished successfully.</w:t>
+              <w:t>The ride finished successfully.</w:t>
             </w:r>
           </w:p>
         </w:tc>
@@ -1452,11 +1282,7 @@
             <w:vAlign w:val="center"/>
           </w:tcPr>
           <w:p>
-            <w:r>
-              <w:rPr>
-                <w:sz w:val="20"/>
-              </w:rPr>
-            </w:r>
+            <w:r/>
             <w:r>
               <w:rPr>
                 <w:b w:val="0"/>
@@ -1472,17 +1298,13 @@
             <w:vAlign w:val="center"/>
           </w:tcPr>
           <w:p>
-            <w:r>
-              <w:rPr>
-                <w:sz w:val="20"/>
-              </w:rPr>
-            </w:r>
+            <w:r/>
             <w:r>
               <w:rPr>
                 <w:b w:val="0"/>
                 <w:sz w:val="20"/>
               </w:rPr>
-              <w:t>Retry limit reached.</w:t>
+              <w:t>The retry limit was reached.</w:t>
             </w:r>
           </w:p>
         </w:tc>
@@ -1494,7 +1316,7 @@
         <w:pStyle w:val="Heading1"/>
       </w:pPr>
       <w:r>
-        <w:t>8. Driver Lifecycle</w:t>
+        <w:t>8. Driver State Machine</w:t>
       </w:r>
     </w:p>
     <w:p>
@@ -1531,11 +1353,7 @@
             <w:shd w:fill="D9EAF7"/>
           </w:tcPr>
           <w:p>
-            <w:r>
-              <w:rPr>
-                <w:sz w:val="20"/>
-              </w:rPr>
-            </w:r>
+            <w:r/>
             <w:r>
               <w:rPr>
                 <w:b/>
@@ -1552,11 +1370,7 @@
             <w:shd w:fill="D9EAF7"/>
           </w:tcPr>
           <w:p>
-            <w:r>
-              <w:rPr>
-                <w:sz w:val="20"/>
-              </w:rPr>
-            </w:r>
+            <w:r/>
             <w:r>
               <w:rPr>
                 <w:b/>
@@ -1574,11 +1388,7 @@
             <w:vAlign w:val="center"/>
           </w:tcPr>
           <w:p>
-            <w:r>
-              <w:rPr>
-                <w:sz w:val="20"/>
-              </w:rPr>
-            </w:r>
+            <w:r/>
             <w:r>
               <w:rPr>
                 <w:b w:val="0"/>
@@ -1594,17 +1404,13 @@
             <w:vAlign w:val="center"/>
           </w:tcPr>
           <w:p>
-            <w:r>
-              <w:rPr>
-                <w:sz w:val="20"/>
-              </w:rPr>
-            </w:r>
+            <w:r/>
             <w:r>
               <w:rPr>
                 <w:b w:val="0"/>
                 <w:sz w:val="20"/>
               </w:rPr>
-              <w:t>Driver can be reserved by a dispatcher.</w:t>
+              <w:t>Driver may be selected by a dispatcher.</w:t>
             </w:r>
           </w:p>
         </w:tc>
@@ -1616,11 +1422,7 @@
             <w:vAlign w:val="center"/>
           </w:tcPr>
           <w:p>
-            <w:r>
-              <w:rPr>
-                <w:sz w:val="20"/>
-              </w:rPr>
-            </w:r>
+            <w:r/>
             <w:r>
               <w:rPr>
                 <w:b w:val="0"/>
@@ -1636,17 +1438,13 @@
             <w:vAlign w:val="center"/>
           </w:tcPr>
           <w:p>
-            <w:r>
-              <w:rPr>
-                <w:sz w:val="20"/>
-              </w:rPr>
-            </w:r>
+            <w:r/>
             <w:r>
               <w:rPr>
                 <w:b w:val="0"/>
                 <w:sz w:val="20"/>
               </w:rPr>
-              <w:t>Driver has a pending offer.</w:t>
+              <w:t>Driver is temporarily held for one booking while confirmation is pending.</w:t>
             </w:r>
           </w:p>
         </w:tc>
@@ -1658,11 +1456,7 @@
             <w:vAlign w:val="center"/>
           </w:tcPr>
           <w:p>
-            <w:r>
-              <w:rPr>
-                <w:sz w:val="20"/>
-              </w:rPr>
-            </w:r>
+            <w:r/>
             <w:r>
               <w:rPr>
                 <w:b w:val="0"/>
@@ -1678,11 +1472,7 @@
             <w:vAlign w:val="center"/>
           </w:tcPr>
           <w:p>
-            <w:r>
-              <w:rPr>
-                <w:sz w:val="20"/>
-              </w:rPr>
-            </w:r>
+            <w:r/>
             <w:r>
               <w:rPr>
                 <w:b w:val="0"/>
@@ -1700,11 +1490,7 @@
             <w:vAlign w:val="center"/>
           </w:tcPr>
           <w:p>
-            <w:r>
-              <w:rPr>
-                <w:sz w:val="20"/>
-              </w:rPr>
-            </w:r>
+            <w:r/>
             <w:r>
               <w:rPr>
                 <w:b w:val="0"/>
@@ -1720,17 +1506,13 @@
             <w:vAlign w:val="center"/>
           </w:tcPr>
           <w:p>
-            <w:r>
-              <w:rPr>
-                <w:sz w:val="20"/>
-              </w:rPr>
-            </w:r>
+            <w:r/>
             <w:r>
               <w:rPr>
                 <w:b w:val="0"/>
                 <w:sz w:val="20"/>
               </w:rPr>
-              <w:t>Defined in code but not currently used by the simulation.</w:t>
+              <w:t>Defined state for future use; not central to current matching flow.</w:t>
             </w:r>
           </w:p>
         </w:tc>
@@ -1742,12 +1524,269 @@
         <w:pStyle w:val="Heading1"/>
       </w:pPr>
       <w:r>
-        <w:t>9. TCP Command Protocol</w:t>
+        <w:t>9. Matching Flow</w:t>
+      </w:r>
+    </w:p>
+    <w:p>
+      <w:pPr>
+        <w:pStyle w:val="ListBullet"/>
+      </w:pPr>
+      <w:r>
+        <w:t>A booking is created in QUEUED state and its ID is pushed into BookingQueue.</w:t>
+      </w:r>
+    </w:p>
+    <w:p>
+      <w:pPr>
+        <w:pStyle w:val="ListBullet"/>
+      </w:pPr>
+      <w:r>
+        <w:t>A dispatcher pops the booking ID and transitions the booking from QUEUED to MATCHING.</w:t>
+      </w:r>
+    </w:p>
+    <w:p>
+      <w:pPr>
+        <w:pStyle w:val="ListBullet"/>
+      </w:pPr>
+      <w:r>
+        <w:t>The dispatcher calls DriverRegistry::find_nearest() to locate an AVAILABLE driver using non-blocking try_lock scans.</w:t>
+      </w:r>
+    </w:p>
+    <w:p>
+      <w:pPr>
+        <w:pStyle w:val="ListBullet"/>
+      </w:pPr>
+      <w:r>
+        <w:t>The dispatcher locks the selected driver and re-checks that it is still AVAILABLE.</w:t>
+      </w:r>
+    </w:p>
+    <w:p>
+      <w:pPr>
+        <w:pStyle w:val="ListBullet"/>
+      </w:pPr>
+      <w:r>
+        <w:t>The dispatcher locks the booking and re-checks that it is still MATCHING.</w:t>
+      </w:r>
+    </w:p>
+    <w:p>
+      <w:pPr>
+        <w:pStyle w:val="ListBullet"/>
+      </w:pPr>
+      <w:r>
+        <w:t>If both checks pass, the booking becomes WAITING and the driver becomes RESERVED with the booking ID attached.</w:t>
+      </w:r>
+    </w:p>
+    <w:p>
+      <w:pPr>
+        <w:pStyle w:val="ListBullet"/>
+      </w:pPr>
+      <w:r>
+        <w:t>If no driver is available, the booking is requeued or failed after reaching the retry limit.</w:t>
+      </w:r>
+    </w:p>
+    <w:p>
+      <w:pPr>
+        <w:pStyle w:val="Heading1"/>
+      </w:pPr>
+      <w:r>
+        <w:t>10. Driver Confirmation Flow</w:t>
+      </w:r>
+    </w:p>
+    <w:tbl>
+      <w:tblPr>
+        <w:tblStyle w:val="TableGrid"/>
+        <w:tblW w:type="auto" w:w="0"/>
+        <w:jc w:val="center"/>
+        <w:tblLook w:firstColumn="1" w:firstRow="1" w:lastColumn="0" w:lastRow="0" w:noHBand="0" w:noVBand="1" w:val="04A0"/>
+      </w:tblPr>
+      <w:tblGrid>
+        <w:gridCol w:w="5040"/>
+        <w:gridCol w:w="5040"/>
+      </w:tblGrid>
+      <w:tr>
+        <w:tc>
+          <w:tcPr>
+            <w:tcW w:type="dxa" w:w="5040"/>
+            <w:vAlign w:val="center"/>
+            <w:shd w:fill="D9EAF7"/>
+          </w:tcPr>
+          <w:p>
+            <w:r/>
+            <w:r>
+              <w:rPr>
+                <w:b/>
+                <w:sz w:val="20"/>
+              </w:rPr>
+              <w:t>Operation</w:t>
+            </w:r>
+          </w:p>
+        </w:tc>
+        <w:tc>
+          <w:tcPr>
+            <w:tcW w:type="dxa" w:w="5040"/>
+            <w:vAlign w:val="center"/>
+            <w:shd w:fill="D9EAF7"/>
+          </w:tcPr>
+          <w:p>
+            <w:r/>
+            <w:r>
+              <w:rPr>
+                <w:b/>
+                <w:sz w:val="20"/>
+              </w:rPr>
+              <w:t>Server behavior</w:t>
+            </w:r>
+          </w:p>
+        </w:tc>
+      </w:tr>
+      <w:tr>
+        <w:tc>
+          <w:tcPr>
+            <w:tcW w:type="dxa" w:w="5040"/>
+            <w:vAlign w:val="center"/>
+          </w:tcPr>
+          <w:p>
+            <w:r/>
+            <w:r>
+              <w:rPr>
+                <w:b w:val="0"/>
+                <w:sz w:val="20"/>
+              </w:rPr>
+              <w:t>ACCEPT</w:t>
+            </w:r>
+          </w:p>
+        </w:tc>
+        <w:tc>
+          <w:tcPr>
+            <w:tcW w:type="dxa" w:w="5040"/>
+            <w:vAlign w:val="center"/>
+          </w:tcPr>
+          <w:p>
+            <w:r/>
+            <w:r>
+              <w:rPr>
+                <w:b w:val="0"/>
+                <w:sz w:val="20"/>
+              </w:rPr>
+              <w:t>Driver must be RESERVED for the booking. Server changes driver to BOOKED and booking to BOOKED.</w:t>
+            </w:r>
+          </w:p>
+        </w:tc>
+      </w:tr>
+      <w:tr>
+        <w:tc>
+          <w:tcPr>
+            <w:tcW w:type="dxa" w:w="5040"/>
+            <w:vAlign w:val="center"/>
+          </w:tcPr>
+          <w:p>
+            <w:r/>
+            <w:r>
+              <w:rPr>
+                <w:b w:val="0"/>
+                <w:sz w:val="20"/>
+              </w:rPr>
+              <w:t>REJECT</w:t>
+            </w:r>
+          </w:p>
+        </w:tc>
+        <w:tc>
+          <w:tcPr>
+            <w:tcW w:type="dxa" w:w="5040"/>
+            <w:vAlign w:val="center"/>
+          </w:tcPr>
+          <w:p>
+            <w:r/>
+            <w:r>
+              <w:rPr>
+                <w:b w:val="0"/>
+                <w:sz w:val="20"/>
+              </w:rPr>
+              <w:t>Driver must be RESERVED for the booking. Server releases driver to AVAILABLE and requeues or fails the booking.</w:t>
+            </w:r>
+          </w:p>
+        </w:tc>
+      </w:tr>
+      <w:tr>
+        <w:tc>
+          <w:tcPr>
+            <w:tcW w:type="dxa" w:w="5040"/>
+            <w:vAlign w:val="center"/>
+          </w:tcPr>
+          <w:p>
+            <w:r/>
+            <w:r>
+              <w:rPr>
+                <w:b w:val="0"/>
+                <w:sz w:val="20"/>
+              </w:rPr>
+              <w:t>FINISH</w:t>
+            </w:r>
+          </w:p>
+        </w:tc>
+        <w:tc>
+          <w:tcPr>
+            <w:tcW w:type="dxa" w:w="5040"/>
+            <w:vAlign w:val="center"/>
+          </w:tcPr>
+          <w:p>
+            <w:r/>
+            <w:r>
+              <w:rPr>
+                <w:b w:val="0"/>
+                <w:sz w:val="20"/>
+              </w:rPr>
+              <w:t>Driver must be BOOKED for the booking. Server completes the booking, updates driver position, and releases driver to AVAILABLE.</w:t>
+            </w:r>
+          </w:p>
+        </w:tc>
+      </w:tr>
+      <w:tr>
+        <w:tc>
+          <w:tcPr>
+            <w:tcW w:type="dxa" w:w="5040"/>
+            <w:vAlign w:val="center"/>
+          </w:tcPr>
+          <w:p>
+            <w:r/>
+            <w:r>
+              <w:rPr>
+                <w:b w:val="0"/>
+                <w:sz w:val="20"/>
+              </w:rPr>
+              <w:t>Timeout</w:t>
+            </w:r>
+          </w:p>
+        </w:tc>
+        <w:tc>
+          <w:tcPr>
+            <w:tcW w:type="dxa" w:w="5040"/>
+            <w:vAlign w:val="center"/>
+          </w:tcPr>
+          <w:p>
+            <w:r/>
+            <w:r>
+              <w:rPr>
+                <w:b w:val="0"/>
+                <w:sz w:val="20"/>
+              </w:rPr>
+              <w:t>Monitor actor releases RESERVED drivers whose confirmation window expired and requeues or fails their bookings.</w:t>
+            </w:r>
+          </w:p>
+        </w:tc>
+      </w:tr>
+    </w:tbl>
+    <w:p/>
+    <w:p>
+      <w:pPr>
+        <w:pStyle w:val="Heading1"/>
+      </w:pPr>
+      <w:r>
+        <w:t>11. Server Command Interface</w:t>
       </w:r>
     </w:p>
     <w:p>
       <w:r>
-        <w:t>The backend uses one newline-terminated spaced command per TCP connection. This is not HTTP and not JSON.</w:t>
+        <w:t>The server exposes a newline-terminated TCP text protocol. Commands are space-separated tokens. The protocol is intentionally minimal so the concurrency logic remains the focus.</w:t>
       </w:r>
     </w:p>
     <w:tbl>
@@ -1770,11 +1809,7 @@
             <w:shd w:fill="D9EAF7"/>
           </w:tcPr>
           <w:p>
-            <w:r>
-              <w:rPr>
-                <w:sz w:val="20"/>
-              </w:rPr>
-            </w:r>
+            <w:r/>
             <w:r>
               <w:rPr>
                 <w:b/>
@@ -1791,11 +1826,7 @@
             <w:shd w:fill="D9EAF7"/>
           </w:tcPr>
           <w:p>
-            <w:r>
-              <w:rPr>
-                <w:sz w:val="20"/>
-              </w:rPr>
-            </w:r>
+            <w:r/>
             <w:r>
               <w:rPr>
                 <w:b/>
@@ -1812,11 +1843,7 @@
             <w:shd w:fill="D9EAF7"/>
           </w:tcPr>
           <w:p>
-            <w:r>
-              <w:rPr>
-                <w:sz w:val="20"/>
-              </w:rPr>
-            </w:r>
+            <w:r/>
             <w:r>
               <w:rPr>
                 <w:b/>
@@ -1834,11 +1861,7 @@
             <w:vAlign w:val="center"/>
           </w:tcPr>
           <w:p>
-            <w:r>
-              <w:rPr>
-                <w:sz w:val="20"/>
-              </w:rPr>
-            </w:r>
+            <w:r/>
             <w:r>
               <w:rPr>
                 <w:b w:val="0"/>
@@ -1854,11 +1877,7 @@
             <w:vAlign w:val="center"/>
           </w:tcPr>
           <w:p>
-            <w:r>
-              <w:rPr>
-                <w:sz w:val="20"/>
-              </w:rPr>
-            </w:r>
+            <w:r/>
             <w:r>
               <w:rPr>
                 <w:b w:val="0"/>
@@ -1874,11 +1893,7 @@
             <w:vAlign w:val="center"/>
           </w:tcPr>
           <w:p>
-            <w:r>
-              <w:rPr>
-                <w:sz w:val="20"/>
-              </w:rPr>
-            </w:r>
+            <w:r/>
             <w:r>
               <w:rPr>
                 <w:b w:val="0"/>
@@ -1896,11 +1911,7 @@
             <w:vAlign w:val="center"/>
           </w:tcPr>
           <w:p>
-            <w:r>
-              <w:rPr>
-                <w:sz w:val="20"/>
-              </w:rPr>
-            </w:r>
+            <w:r/>
             <w:r>
               <w:rPr>
                 <w:b w:val="0"/>
@@ -1916,11 +1927,7 @@
             <w:vAlign w:val="center"/>
           </w:tcPr>
           <w:p>
-            <w:r>
-              <w:rPr>
-                <w:sz w:val="20"/>
-              </w:rPr>
-            </w:r>
+            <w:r/>
             <w:r>
               <w:rPr>
                 <w:b w:val="0"/>
@@ -1936,11 +1943,7 @@
             <w:vAlign w:val="center"/>
           </w:tcPr>
           <w:p>
-            <w:r>
-              <w:rPr>
-                <w:sz w:val="20"/>
-              </w:rPr>
-            </w:r>
+            <w:r/>
             <w:r>
               <w:rPr>
                 <w:b w:val="0"/>
@@ -1958,11 +1961,7 @@
             <w:vAlign w:val="center"/>
           </w:tcPr>
           <w:p>
-            <w:r>
-              <w:rPr>
-                <w:sz w:val="20"/>
-              </w:rPr>
-            </w:r>
+            <w:r/>
             <w:r>
               <w:rPr>
                 <w:b w:val="0"/>
@@ -1978,11 +1977,7 @@
             <w:vAlign w:val="center"/>
           </w:tcPr>
           <w:p>
-            <w:r>
-              <w:rPr>
-                <w:sz w:val="20"/>
-              </w:rPr>
-            </w:r>
+            <w:r/>
             <w:r>
               <w:rPr>
                 <w:b w:val="0"/>
@@ -1998,11 +1993,7 @@
             <w:vAlign w:val="center"/>
           </w:tcPr>
           <w:p>
-            <w:r>
-              <w:rPr>
-                <w:sz w:val="20"/>
-              </w:rPr>
-            </w:r>
+            <w:r/>
             <w:r>
               <w:rPr>
                 <w:b w:val="0"/>
@@ -2020,11 +2011,7 @@
             <w:vAlign w:val="center"/>
           </w:tcPr>
           <w:p>
-            <w:r>
-              <w:rPr>
-                <w:sz w:val="20"/>
-              </w:rPr>
-            </w:r>
+            <w:r/>
             <w:r>
               <w:rPr>
                 <w:b w:val="0"/>
@@ -2040,11 +2027,7 @@
             <w:vAlign w:val="center"/>
           </w:tcPr>
           <w:p>
-            <w:r>
-              <w:rPr>
-                <w:sz w:val="20"/>
-              </w:rPr>
-            </w:r>
+            <w:r/>
             <w:r>
               <w:rPr>
                 <w:b w:val="0"/>
@@ -2060,11 +2043,7 @@
             <w:vAlign w:val="center"/>
           </w:tcPr>
           <w:p>
-            <w:r>
-              <w:rPr>
-                <w:sz w:val="20"/>
-              </w:rPr>
-            </w:r>
+            <w:r/>
             <w:r>
               <w:rPr>
                 <w:b w:val="0"/>
@@ -2082,11 +2061,7 @@
             <w:vAlign w:val="center"/>
           </w:tcPr>
           <w:p>
-            <w:r>
-              <w:rPr>
-                <w:sz w:val="20"/>
-              </w:rPr>
-            </w:r>
+            <w:r/>
             <w:r>
               <w:rPr>
                 <w:b w:val="0"/>
@@ -2102,11 +2077,7 @@
             <w:vAlign w:val="center"/>
           </w:tcPr>
           <w:p>
-            <w:r>
-              <w:rPr>
-                <w:sz w:val="20"/>
-              </w:rPr>
-            </w:r>
+            <w:r/>
             <w:r>
               <w:rPr>
                 <w:b w:val="0"/>
@@ -2122,11 +2093,7 @@
             <w:vAlign w:val="center"/>
           </w:tcPr>
           <w:p>
-            <w:r>
-              <w:rPr>
-                <w:sz w:val="20"/>
-              </w:rPr>
-            </w:r>
+            <w:r/>
             <w:r>
               <w:rPr>
                 <w:b w:val="0"/>
@@ -2144,11 +2111,7 @@
             <w:vAlign w:val="center"/>
           </w:tcPr>
           <w:p>
-            <w:r>
-              <w:rPr>
-                <w:sz w:val="20"/>
-              </w:rPr>
-            </w:r>
+            <w:r/>
             <w:r>
               <w:rPr>
                 <w:b w:val="0"/>
@@ -2164,11 +2127,7 @@
             <w:vAlign w:val="center"/>
           </w:tcPr>
           <w:p>
-            <w:r>
-              <w:rPr>
-                <w:sz w:val="20"/>
-              </w:rPr>
-            </w:r>
+            <w:r/>
             <w:r>
               <w:rPr>
                 <w:b w:val="0"/>
@@ -2184,11 +2143,7 @@
             <w:vAlign w:val="center"/>
           </w:tcPr>
           <w:p>
-            <w:r>
-              <w:rPr>
-                <w:sz w:val="20"/>
-              </w:rPr>
-            </w:r>
+            <w:r/>
             <w:r>
               <w:rPr>
                 <w:b w:val="0"/>
@@ -2206,11 +2161,7 @@
             <w:vAlign w:val="center"/>
           </w:tcPr>
           <w:p>
-            <w:r>
-              <w:rPr>
-                <w:sz w:val="20"/>
-              </w:rPr>
-            </w:r>
+            <w:r/>
             <w:r>
               <w:rPr>
                 <w:b w:val="0"/>
@@ -2226,11 +2177,7 @@
             <w:vAlign w:val="center"/>
           </w:tcPr>
           <w:p>
-            <w:r>
-              <w:rPr>
-                <w:sz w:val="20"/>
-              </w:rPr>
-            </w:r>
+            <w:r/>
             <w:r>
               <w:rPr>
                 <w:b w:val="0"/>
@@ -2246,11 +2193,7 @@
             <w:vAlign w:val="center"/>
           </w:tcPr>
           <w:p>
-            <w:r>
-              <w:rPr>
-                <w:sz w:val="20"/>
-              </w:rPr>
-            </w:r>
+            <w:r/>
             <w:r>
               <w:rPr>
                 <w:b w:val="0"/>
@@ -2268,11 +2211,7 @@
             <w:vAlign w:val="center"/>
           </w:tcPr>
           <w:p>
-            <w:r>
-              <w:rPr>
-                <w:sz w:val="20"/>
-              </w:rPr>
-            </w:r>
+            <w:r/>
             <w:r>
               <w:rPr>
                 <w:b w:val="0"/>
@@ -2288,11 +2227,7 @@
             <w:vAlign w:val="center"/>
           </w:tcPr>
           <w:p>
-            <w:r>
-              <w:rPr>
-                <w:sz w:val="20"/>
-              </w:rPr>
-            </w:r>
+            <w:r/>
             <w:r>
               <w:rPr>
                 <w:b w:val="0"/>
@@ -2308,11 +2243,7 @@
             <w:vAlign w:val="center"/>
           </w:tcPr>
           <w:p>
-            <w:r>
-              <w:rPr>
-                <w:sz w:val="20"/>
-              </w:rPr>
-            </w:r>
+            <w:r/>
             <w:r>
               <w:rPr>
                 <w:b w:val="0"/>
@@ -2326,16 +2257,59 @@
     </w:tbl>
     <w:p/>
     <w:p>
+      <w:pPr>
+        <w:pStyle w:val="Heading1"/>
+      </w:pPr>
       <w:r>
-        <w:rPr>
-          <w:rFonts w:ascii="Courier New" w:hAnsi="Courier New" w:eastAsia="Courier New"/>
-          <w:sz w:val="18"/>
-        </w:rPr>
-        <w:t>printf 'BOOK 1 2 8 9\n' | nc 127.0.0.1 8000</w:t>
-        <w:br/>
-        <w:t>printf 'DRIVERS\n' | nc 127.0.0.1 8000</w:t>
-        <w:br/>
-        <w:t>printf 'ACCEPT 3 1\n' | nc 127.0.0.1 8000</w:t>
+        <w:t>12. Correctness Invariants</w:t>
+      </w:r>
+    </w:p>
+    <w:p>
+      <w:pPr>
+        <w:pStyle w:val="ListBullet"/>
+      </w:pPr>
+      <w:r>
+        <w:t>A driver in AVAILABLE state must have booking_id == -1.</w:t>
+      </w:r>
+    </w:p>
+    <w:p>
+      <w:pPr>
+        <w:pStyle w:val="ListBullet"/>
+      </w:pPr>
+      <w:r>
+        <w:t>A driver in RESERVED or BOOKED state must have a valid booking_id.</w:t>
+      </w:r>
+    </w:p>
+    <w:p>
+      <w:pPr>
+        <w:pStyle w:val="ListBullet"/>
+      </w:pPr>
+      <w:r>
+        <w:t>A booking in WAITING or BOOKED state must have a valid driver_id.</w:t>
+      </w:r>
+    </w:p>
+    <w:p>
+      <w:pPr>
+        <w:pStyle w:val="ListBullet"/>
+      </w:pPr>
+      <w:r>
+        <w:t>A COMPLETED or FAILED booking must not be requeued.</w:t>
+      </w:r>
+    </w:p>
+    <w:p>
+      <w:pPr>
+        <w:pStyle w:val="ListBullet"/>
+      </w:pPr>
+      <w:r>
+        <w:t>A driver must not appear as the active driver for two different active bookings.</w:t>
+      </w:r>
+    </w:p>
+    <w:p>
+      <w:pPr>
+        <w:pStyle w:val="ListBullet"/>
+      </w:pPr>
+      <w:r>
+        <w:t>The check of driver availability and the assignment of that driver must be atomic with respect to other dispatcher threads.</w:t>
       </w:r>
     </w:p>
     <w:p>
@@ -2343,404 +2317,7 @@
         <w:pStyle w:val="Heading1"/>
       </w:pPr>
       <w:r>
-        <w:t>10. Team Ownership and Coordination</w:t>
-      </w:r>
-    </w:p>
-    <w:tbl>
-      <w:tblPr>
-        <w:tblStyle w:val="TableGrid"/>
-        <w:tblW w:type="auto" w:w="0"/>
-        <w:jc w:val="center"/>
-        <w:tblLook w:firstColumn="1" w:firstRow="1" w:lastColumn="0" w:lastRow="0" w:noHBand="0" w:noVBand="1" w:val="04A0"/>
-      </w:tblPr>
-      <w:tblGrid>
-        <w:gridCol w:w="3360"/>
-        <w:gridCol w:w="3360"/>
-        <w:gridCol w:w="3360"/>
-      </w:tblGrid>
-      <w:tr>
-        <w:tc>
-          <w:tcPr>
-            <w:tcW w:type="dxa" w:w="3360"/>
-            <w:vAlign w:val="center"/>
-            <w:shd w:fill="D9EAF7"/>
-          </w:tcPr>
-          <w:p>
-            <w:r>
-              <w:rPr>
-                <w:sz w:val="20"/>
-              </w:rPr>
-            </w:r>
-            <w:r>
-              <w:rPr>
-                <w:b/>
-                <w:sz w:val="20"/>
-              </w:rPr>
-              <w:t>Area</w:t>
-            </w:r>
-          </w:p>
-        </w:tc>
-        <w:tc>
-          <w:tcPr>
-            <w:tcW w:type="dxa" w:w="3360"/>
-            <w:vAlign w:val="center"/>
-            <w:shd w:fill="D9EAF7"/>
-          </w:tcPr>
-          <w:p>
-            <w:r>
-              <w:rPr>
-                <w:sz w:val="20"/>
-              </w:rPr>
-            </w:r>
-            <w:r>
-              <w:rPr>
-                <w:b/>
-                <w:sz w:val="20"/>
-              </w:rPr>
-              <w:t>Primary files</w:t>
-            </w:r>
-          </w:p>
-        </w:tc>
-        <w:tc>
-          <w:tcPr>
-            <w:tcW w:type="dxa" w:w="3360"/>
-            <w:vAlign w:val="center"/>
-            <w:shd w:fill="D9EAF7"/>
-          </w:tcPr>
-          <w:p>
-            <w:r>
-              <w:rPr>
-                <w:sz w:val="20"/>
-              </w:rPr>
-            </w:r>
-            <w:r>
-              <w:rPr>
-                <w:b/>
-                <w:sz w:val="20"/>
-              </w:rPr>
-              <w:t>Responsibilities</w:t>
-            </w:r>
-          </w:p>
-        </w:tc>
-      </w:tr>
-      <w:tr>
-        <w:tc>
-          <w:tcPr>
-            <w:tcW w:type="dxa" w:w="3360"/>
-            <w:vAlign w:val="center"/>
-          </w:tcPr>
-          <w:p>
-            <w:r>
-              <w:rPr>
-                <w:sz w:val="20"/>
-              </w:rPr>
-            </w:r>
-            <w:r>
-              <w:rPr>
-                <w:b w:val="0"/>
-                <w:sz w:val="20"/>
-              </w:rPr>
-              <w:t>Backend/concurrency</w:t>
-            </w:r>
-          </w:p>
-        </w:tc>
-        <w:tc>
-          <w:tcPr>
-            <w:tcW w:type="dxa" w:w="3360"/>
-            <w:vAlign w:val="center"/>
-          </w:tcPr>
-          <w:p>
-            <w:r>
-              <w:rPr>
-                <w:sz w:val="20"/>
-              </w:rPr>
-            </w:r>
-            <w:r>
-              <w:rPr>
-                <w:b w:val="0"/>
-                <w:sz w:val="20"/>
-              </w:rPr>
-              <w:t>main.cpp</w:t>
-            </w:r>
-          </w:p>
-        </w:tc>
-        <w:tc>
-          <w:tcPr>
-            <w:tcW w:type="dxa" w:w="3360"/>
-            <w:vAlign w:val="center"/>
-          </w:tcPr>
-          <w:p>
-            <w:r>
-              <w:rPr>
-                <w:sz w:val="20"/>
-              </w:rPr>
-            </w:r>
-            <w:r>
-              <w:rPr>
-                <w:b w:val="0"/>
-                <w:sz w:val="20"/>
-              </w:rPr>
-              <w:t>Dispatcher logic, monitor actor, state transitions, lock correctness.</w:t>
-            </w:r>
-          </w:p>
-        </w:tc>
-      </w:tr>
-      <w:tr>
-        <w:tc>
-          <w:tcPr>
-            <w:tcW w:type="dxa" w:w="3360"/>
-            <w:vAlign w:val="center"/>
-          </w:tcPr>
-          <w:p>
-            <w:r>
-              <w:rPr>
-                <w:sz w:val="20"/>
-              </w:rPr>
-            </w:r>
-            <w:r>
-              <w:rPr>
-                <w:b w:val="0"/>
-                <w:sz w:val="20"/>
-              </w:rPr>
-              <w:t>Passenger simulation</w:t>
-            </w:r>
-          </w:p>
-        </w:tc>
-        <w:tc>
-          <w:tcPr>
-            <w:tcW w:type="dxa" w:w="3360"/>
-            <w:vAlign w:val="center"/>
-          </w:tcPr>
-          <w:p>
-            <w:r>
-              <w:rPr>
-                <w:sz w:val="20"/>
-              </w:rPr>
-            </w:r>
-            <w:r>
-              <w:rPr>
-                <w:b w:val="0"/>
-                <w:sz w:val="20"/>
-              </w:rPr>
-              <w:t>simulate_user.cpp</w:t>
-            </w:r>
-          </w:p>
-        </w:tc>
-        <w:tc>
-          <w:tcPr>
-            <w:tcW w:type="dxa" w:w="3360"/>
-            <w:vAlign w:val="center"/>
-          </w:tcPr>
-          <w:p>
-            <w:r>
-              <w:rPr>
-                <w:sz w:val="20"/>
-              </w:rPr>
-            </w:r>
-            <w:r>
-              <w:rPr>
-                <w:b w:val="0"/>
-                <w:sz w:val="20"/>
-              </w:rPr>
-              <w:t>Passenger thread behavior, booking creation, polling display.</w:t>
-            </w:r>
-          </w:p>
-        </w:tc>
-      </w:tr>
-      <w:tr>
-        <w:tc>
-          <w:tcPr>
-            <w:tcW w:type="dxa" w:w="3360"/>
-            <w:vAlign w:val="center"/>
-          </w:tcPr>
-          <w:p>
-            <w:r>
-              <w:rPr>
-                <w:sz w:val="20"/>
-              </w:rPr>
-            </w:r>
-            <w:r>
-              <w:rPr>
-                <w:b w:val="0"/>
-                <w:sz w:val="20"/>
-              </w:rPr>
-              <w:t>Driver simulation</w:t>
-            </w:r>
-          </w:p>
-        </w:tc>
-        <w:tc>
-          <w:tcPr>
-            <w:tcW w:type="dxa" w:w="3360"/>
-            <w:vAlign w:val="center"/>
-          </w:tcPr>
-          <w:p>
-            <w:r>
-              <w:rPr>
-                <w:sz w:val="20"/>
-              </w:rPr>
-            </w:r>
-            <w:r>
-              <w:rPr>
-                <w:b w:val="0"/>
-                <w:sz w:val="20"/>
-              </w:rPr>
-              <w:t>simulate_driver.cpp</w:t>
-            </w:r>
-          </w:p>
-        </w:tc>
-        <w:tc>
-          <w:tcPr>
-            <w:tcW w:type="dxa" w:w="3360"/>
-            <w:vAlign w:val="center"/>
-          </w:tcPr>
-          <w:p>
-            <w:r>
-              <w:rPr>
-                <w:sz w:val="20"/>
-              </w:rPr>
-            </w:r>
-            <w:r>
-              <w:rPr>
-                <w:b w:val="0"/>
-                <w:sz w:val="20"/>
-              </w:rPr>
-              <w:t>Driver dashboard, accept/reject/finish automation.</w:t>
-            </w:r>
-          </w:p>
-        </w:tc>
-      </w:tr>
-      <w:tr>
-        <w:tc>
-          <w:tcPr>
-            <w:tcW w:type="dxa" w:w="3360"/>
-            <w:vAlign w:val="center"/>
-          </w:tcPr>
-          <w:p>
-            <w:r>
-              <w:rPr>
-                <w:sz w:val="20"/>
-              </w:rPr>
-            </w:r>
-            <w:r>
-              <w:rPr>
-                <w:b w:val="0"/>
-                <w:sz w:val="20"/>
-              </w:rPr>
-              <w:t>Testing</w:t>
-            </w:r>
-          </w:p>
-        </w:tc>
-        <w:tc>
-          <w:tcPr>
-            <w:tcW w:type="dxa" w:w="3360"/>
-            <w:vAlign w:val="center"/>
-          </w:tcPr>
-          <w:p>
-            <w:r>
-              <w:rPr>
-                <w:sz w:val="20"/>
-              </w:rPr>
-            </w:r>
-            <w:r>
-              <w:rPr>
-                <w:b w:val="0"/>
-                <w:sz w:val="20"/>
-              </w:rPr>
-              <w:t>loadtest.cpp, loadtest.sh, check_double_booking.sh</w:t>
-            </w:r>
-          </w:p>
-        </w:tc>
-        <w:tc>
-          <w:tcPr>
-            <w:tcW w:type="dxa" w:w="3360"/>
-            <w:vAlign w:val="center"/>
-          </w:tcPr>
-          <w:p>
-            <w:r>
-              <w:rPr>
-                <w:sz w:val="20"/>
-              </w:rPr>
-            </w:r>
-            <w:r>
-              <w:rPr>
-                <w:b w:val="0"/>
-                <w:sz w:val="20"/>
-              </w:rPr>
-              <w:t>Stress tests, correctness monitoring, repeatable test procedure.</w:t>
-            </w:r>
-          </w:p>
-        </w:tc>
-      </w:tr>
-      <w:tr>
-        <w:tc>
-          <w:tcPr>
-            <w:tcW w:type="dxa" w:w="3360"/>
-            <w:vAlign w:val="center"/>
-          </w:tcPr>
-          <w:p>
-            <w:r>
-              <w:rPr>
-                <w:sz w:val="20"/>
-              </w:rPr>
-            </w:r>
-            <w:r>
-              <w:rPr>
-                <w:b w:val="0"/>
-                <w:sz w:val="20"/>
-              </w:rPr>
-              <w:t>Documentation/demo</w:t>
-            </w:r>
-          </w:p>
-        </w:tc>
-        <w:tc>
-          <w:tcPr>
-            <w:tcW w:type="dxa" w:w="3360"/>
-            <w:vAlign w:val="center"/>
-          </w:tcPr>
-          <w:p>
-            <w:r>
-              <w:rPr>
-                <w:sz w:val="20"/>
-              </w:rPr>
-            </w:r>
-            <w:r>
-              <w:rPr>
-                <w:b w:val="0"/>
-                <w:sz w:val="20"/>
-              </w:rPr>
-              <w:t>SYSTEM_DESIGN.docx, API.md, slides</w:t>
-            </w:r>
-          </w:p>
-        </w:tc>
-        <w:tc>
-          <w:tcPr>
-            <w:tcW w:type="dxa" w:w="3360"/>
-            <w:vAlign w:val="center"/>
-          </w:tcPr>
-          <w:p>
-            <w:r>
-              <w:rPr>
-                <w:sz w:val="20"/>
-              </w:rPr>
-            </w:r>
-            <w:r>
-              <w:rPr>
-                <w:b w:val="0"/>
-                <w:sz w:val="20"/>
-              </w:rPr>
-              <w:t>Architecture explanation, protocol docs, demo script.</w:t>
-            </w:r>
-          </w:p>
-        </w:tc>
-      </w:tr>
-    </w:tbl>
-    <w:p/>
-    <w:p>
-      <w:pPr>
-        <w:pStyle w:val="Heading1"/>
-      </w:pPr>
-      <w:r>
-        <w:t>11. Integration Rules</w:t>
+        <w:t>13. Failure Handling</w:t>
       </w:r>
     </w:p>
     <w:p>
@@ -2748,7 +2325,7 @@
         <w:pStyle w:val="ListBullet"/>
       </w:pPr>
       <w:r>
-        <w:t>If the command protocol changes, update main.cpp, both simulators, both load tests, check_double_booking.sh, API.md, and this design document.</w:t>
+        <w:t>If a selected driver is no longer AVAILABLE by the time the dispatcher locks it, the dispatcher retries.</w:t>
       </w:r>
     </w:p>
     <w:p>
@@ -2756,7 +2333,7 @@
         <w:pStyle w:val="ListBullet"/>
       </w:pPr>
       <w:r>
-        <w:t>If state transitions change, update the booking and driver lifecycle sections.</w:t>
+        <w:t>If no drivers are available, the booking is requeued after a delay.</w:t>
       </w:r>
     </w:p>
     <w:p>
@@ -2764,7 +2341,7 @@
         <w:pStyle w:val="ListBullet"/>
       </w:pPr>
       <w:r>
-        <w:t>If touching driver or booking state, follow the lock order and update invariants if needed.</w:t>
+        <w:t>If a driver rejects or times out, the booking retry count is incremented.</w:t>
       </w:r>
     </w:p>
     <w:p>
@@ -2772,7 +2349,7 @@
         <w:pStyle w:val="ListBullet"/>
       </w:pPr>
       <w:r>
-        <w:t>Compile before merging changes.</w:t>
+        <w:t>When retry_count reaches MAX_BOOKING_RETRIES, the booking transitions to FAILED.</w:t>
       </w:r>
     </w:p>
     <w:p>
@@ -2780,22 +2357,7 @@
         <w:pStyle w:val="ListBullet"/>
       </w:pPr>
       <w:r>
-        <w:t>Run at least one demo flow and, when possible, run the double-booking monitor during testing.</w:t>
-      </w:r>
-    </w:p>
-    <w:p>
-      <w:r>
-        <w:rPr>
-          <w:rFonts w:ascii="Courier New" w:hAnsi="Courier New" w:eastAsia="Courier New"/>
-          <w:sz w:val="18"/>
-        </w:rPr>
-        <w:t>g++ -std=c++17 -Wall -Wextra -pthread main.cpp -o core2</w:t>
-        <w:br/>
-        <w:t>g++ -std=c++17 -Wall -Wextra -pthread simulate_user.cpp -o simulate_user</w:t>
-        <w:br/>
-        <w:t>g++ -std=c++17 -Wall -Wextra -pthread simulate_driver.cpp -o simulate_driver</w:t>
-        <w:br/>
-        <w:t>g++ -std=c++17 -Wall -Wextra -pthread loadtest.cpp -o loadtest</w:t>
+        <w:t>Invalid commands or stale driver actions return ERR instead of changing state.</w:t>
       </w:r>
     </w:p>
     <w:p>
@@ -2803,46 +2365,7 @@
         <w:pStyle w:val="Heading1"/>
       </w:pPr>
       <w:r>
-        <w:t>12. Demo Script</w:t>
-      </w:r>
-    </w:p>
-    <w:p>
-      <w:r>
-        <w:rPr>
-          <w:rFonts w:ascii="Courier New" w:hAnsi="Courier New" w:eastAsia="Courier New"/>
-          <w:sz w:val="18"/>
-        </w:rPr>
-        <w:t># Terminal 1 — backend</w:t>
-        <w:br/>
-        <w:t>./run_backend.sh</w:t>
-        <w:br/>
-        <w:br/>
-        <w:t># Terminal 2 — driver dashboard</w:t>
-        <w:br/>
-        <w:t>./simulate_driver</w:t>
-        <w:br/>
-        <w:br/>
-        <w:t># Terminal 3 — passenger simulator</w:t>
-        <w:br/>
-        <w:t>./simulate_user</w:t>
-        <w:br/>
-        <w:br/>
-        <w:t># Optional correctness monitor</w:t>
-        <w:br/>
-        <w:t>./check_double_booking.sh</w:t>
-        <w:br/>
-        <w:br/>
-        <w:t># Optional stress test</w:t>
-        <w:br/>
-        <w:t>./loadtest.sh 50 150 10 150</w:t>
-      </w:r>
-    </w:p>
-    <w:p>
-      <w:pPr>
-        <w:pStyle w:val="Heading1"/>
-      </w:pPr>
-      <w:r>
-        <w:t>13. Known Limitations</w:t>
+        <w:t>14. Design Limitations</w:t>
       </w:r>
     </w:p>
     <w:p>
@@ -2850,7 +2373,7 @@
         <w:pStyle w:val="ListBullet"/>
       </w:pPr>
       <w:r>
-        <w:t>The socket command handler processes one connection at a time.</w:t>
+        <w:t>The command handler is single-threaded, so network command processing is serialized.</w:t>
       </w:r>
     </w:p>
     <w:p>
@@ -2858,7 +2381,7 @@
         <w:pStyle w:val="ListBullet"/>
       </w:pPr>
       <w:r>
-        <w:t>The protocol is plain TCP text, not HTTP/JSON.</w:t>
+        <w:t>All state is in memory; there is no persistent storage.</w:t>
       </w:r>
     </w:p>
     <w:p>
@@ -2866,7 +2389,7 @@
         <w:pStyle w:val="ListBullet"/>
       </w:pPr>
       <w:r>
-        <w:t>Data is in memory only; restarting the backend loses all bookings.</w:t>
+        <w:t>Driver lookup uses simple Manhattan distance on a small grid.</w:t>
       </w:r>
     </w:p>
     <w:p>
@@ -2874,7 +2397,7 @@
         <w:pStyle w:val="ListBullet"/>
       </w:pPr>
       <w:r>
-        <w:t>Driver and passenger locations are random grid positions.</w:t>
+        <w:t>The server uses a plain TCP text protocol, not HTTP.</w:t>
       </w:r>
     </w:p>
     <w:p>
@@ -2882,334 +2405,9 @@
         <w:pStyle w:val="ListBullet"/>
       </w:pPr>
       <w:r>
-        <w:t>Nearest-driver search is simple Manhattan distance, not real routing.</w:t>
+        <w:t>The model is intended for concurrency demonstration, not production ride dispatch.</w:t>
       </w:r>
     </w:p>
-    <w:p>
-      <w:pPr>
-        <w:pStyle w:val="ListBullet"/>
-      </w:pPr>
-      <w:r>
-        <w:t>OFFLINE state exists but is not used by the current simulator.</w:t>
-      </w:r>
-    </w:p>
-    <w:p>
-      <w:pPr>
-        <w:pStyle w:val="Heading1"/>
-      </w:pPr>
-      <w:r>
-        <w:t>14. Open Checklist for Groupmates</w:t>
-      </w:r>
-    </w:p>
-    <w:tbl>
-      <w:tblPr>
-        <w:tblStyle w:val="TableGrid"/>
-        <w:tblW w:type="auto" w:w="0"/>
-        <w:jc w:val="center"/>
-        <w:tblLook w:firstColumn="1" w:firstRow="1" w:lastColumn="0" w:lastRow="0" w:noHBand="0" w:noVBand="1" w:val="04A0"/>
-      </w:tblPr>
-      <w:tblGrid>
-        <w:gridCol w:w="5040"/>
-        <w:gridCol w:w="5040"/>
-      </w:tblGrid>
-      <w:tr>
-        <w:tc>
-          <w:tcPr>
-            <w:tcW w:type="dxa" w:w="5040"/>
-            <w:vAlign w:val="center"/>
-            <w:shd w:fill="D9EAF7"/>
-          </w:tcPr>
-          <w:p>
-            <w:r>
-              <w:rPr>
-                <w:sz w:val="20"/>
-              </w:rPr>
-            </w:r>
-            <w:r>
-              <w:rPr>
-                <w:b/>
-                <w:sz w:val="20"/>
-              </w:rPr>
-              <w:t>Question</w:t>
-            </w:r>
-          </w:p>
-        </w:tc>
-        <w:tc>
-          <w:tcPr>
-            <w:tcW w:type="dxa" w:w="5040"/>
-            <w:vAlign w:val="center"/>
-            <w:shd w:fill="D9EAF7"/>
-          </w:tcPr>
-          <w:p>
-            <w:r>
-              <w:rPr>
-                <w:sz w:val="20"/>
-              </w:rPr>
-            </w:r>
-            <w:r>
-              <w:rPr>
-                <w:b/>
-                <w:sz w:val="20"/>
-              </w:rPr>
-              <w:t>Owner / Answer</w:t>
-            </w:r>
-          </w:p>
-        </w:tc>
-      </w:tr>
-      <w:tr>
-        <w:tc>
-          <w:tcPr>
-            <w:tcW w:type="dxa" w:w="5040"/>
-            <w:vAlign w:val="center"/>
-          </w:tcPr>
-          <w:p>
-            <w:r>
-              <w:rPr>
-                <w:sz w:val="20"/>
-              </w:rPr>
-            </w:r>
-            <w:r>
-              <w:rPr>
-                <w:b w:val="0"/>
-                <w:sz w:val="20"/>
-              </w:rPr>
-              <w:t>Who owns final backend changes?</w:t>
-            </w:r>
-          </w:p>
-        </w:tc>
-        <w:tc>
-          <w:tcPr>
-            <w:tcW w:type="dxa" w:w="5040"/>
-            <w:vAlign w:val="center"/>
-          </w:tcPr>
-          <w:p>
-            <w:r>
-              <w:rPr>
-                <w:sz w:val="20"/>
-              </w:rPr>
-            </w:r>
-            <w:r>
-              <w:rPr>
-                <w:b w:val="0"/>
-                <w:sz w:val="20"/>
-              </w:rPr>
-              <w:t>TBD</w:t>
-            </w:r>
-          </w:p>
-        </w:tc>
-      </w:tr>
-      <w:tr>
-        <w:tc>
-          <w:tcPr>
-            <w:tcW w:type="dxa" w:w="5040"/>
-            <w:vAlign w:val="center"/>
-          </w:tcPr>
-          <w:p>
-            <w:r>
-              <w:rPr>
-                <w:sz w:val="20"/>
-              </w:rPr>
-            </w:r>
-            <w:r>
-              <w:rPr>
-                <w:b w:val="0"/>
-                <w:sz w:val="20"/>
-              </w:rPr>
-              <w:t>Who owns passenger simulator/demo?</w:t>
-            </w:r>
-          </w:p>
-        </w:tc>
-        <w:tc>
-          <w:tcPr>
-            <w:tcW w:type="dxa" w:w="5040"/>
-            <w:vAlign w:val="center"/>
-          </w:tcPr>
-          <w:p>
-            <w:r>
-              <w:rPr>
-                <w:sz w:val="20"/>
-              </w:rPr>
-            </w:r>
-            <w:r>
-              <w:rPr>
-                <w:b w:val="0"/>
-                <w:sz w:val="20"/>
-              </w:rPr>
-              <w:t>TBD</w:t>
-            </w:r>
-          </w:p>
-        </w:tc>
-      </w:tr>
-      <w:tr>
-        <w:tc>
-          <w:tcPr>
-            <w:tcW w:type="dxa" w:w="5040"/>
-            <w:vAlign w:val="center"/>
-          </w:tcPr>
-          <w:p>
-            <w:r>
-              <w:rPr>
-                <w:sz w:val="20"/>
-              </w:rPr>
-            </w:r>
-            <w:r>
-              <w:rPr>
-                <w:b w:val="0"/>
-                <w:sz w:val="20"/>
-              </w:rPr>
-              <w:t>Who owns driver simulator/demo?</w:t>
-            </w:r>
-          </w:p>
-        </w:tc>
-        <w:tc>
-          <w:tcPr>
-            <w:tcW w:type="dxa" w:w="5040"/>
-            <w:vAlign w:val="center"/>
-          </w:tcPr>
-          <w:p>
-            <w:r>
-              <w:rPr>
-                <w:sz w:val="20"/>
-              </w:rPr>
-            </w:r>
-            <w:r>
-              <w:rPr>
-                <w:b w:val="0"/>
-                <w:sz w:val="20"/>
-              </w:rPr>
-              <w:t>TBD</w:t>
-            </w:r>
-          </w:p>
-        </w:tc>
-      </w:tr>
-      <w:tr>
-        <w:tc>
-          <w:tcPr>
-            <w:tcW w:type="dxa" w:w="5040"/>
-            <w:vAlign w:val="center"/>
-          </w:tcPr>
-          <w:p>
-            <w:r>
-              <w:rPr>
-                <w:sz w:val="20"/>
-              </w:rPr>
-            </w:r>
-            <w:r>
-              <w:rPr>
-                <w:b w:val="0"/>
-                <w:sz w:val="20"/>
-              </w:rPr>
-              <w:t>Who owns testing and screenshots?</w:t>
-            </w:r>
-          </w:p>
-        </w:tc>
-        <w:tc>
-          <w:tcPr>
-            <w:tcW w:type="dxa" w:w="5040"/>
-            <w:vAlign w:val="center"/>
-          </w:tcPr>
-          <w:p>
-            <w:r>
-              <w:rPr>
-                <w:sz w:val="20"/>
-              </w:rPr>
-            </w:r>
-            <w:r>
-              <w:rPr>
-                <w:b w:val="0"/>
-                <w:sz w:val="20"/>
-              </w:rPr>
-              <w:t>TBD</w:t>
-            </w:r>
-          </w:p>
-        </w:tc>
-      </w:tr>
-      <w:tr>
-        <w:tc>
-          <w:tcPr>
-            <w:tcW w:type="dxa" w:w="5040"/>
-            <w:vAlign w:val="center"/>
-          </w:tcPr>
-          <w:p>
-            <w:r>
-              <w:rPr>
-                <w:sz w:val="20"/>
-              </w:rPr>
-            </w:r>
-            <w:r>
-              <w:rPr>
-                <w:b w:val="0"/>
-                <w:sz w:val="20"/>
-              </w:rPr>
-              <w:t>Who updates slides and final writeup?</w:t>
-            </w:r>
-          </w:p>
-        </w:tc>
-        <w:tc>
-          <w:tcPr>
-            <w:tcW w:type="dxa" w:w="5040"/>
-            <w:vAlign w:val="center"/>
-          </w:tcPr>
-          <w:p>
-            <w:r>
-              <w:rPr>
-                <w:sz w:val="20"/>
-              </w:rPr>
-            </w:r>
-            <w:r>
-              <w:rPr>
-                <w:b w:val="0"/>
-                <w:sz w:val="20"/>
-              </w:rPr>
-              <w:t>TBD</w:t>
-            </w:r>
-          </w:p>
-        </w:tc>
-      </w:tr>
-      <w:tr>
-        <w:tc>
-          <w:tcPr>
-            <w:tcW w:type="dxa" w:w="5040"/>
-            <w:vAlign w:val="center"/>
-          </w:tcPr>
-          <w:p>
-            <w:r>
-              <w:rPr>
-                <w:sz w:val="20"/>
-              </w:rPr>
-            </w:r>
-            <w:r>
-              <w:rPr>
-                <w:b w:val="0"/>
-                <w:sz w:val="20"/>
-              </w:rPr>
-              <w:t>Which exact demo commands will be shown?</w:t>
-            </w:r>
-          </w:p>
-        </w:tc>
-        <w:tc>
-          <w:tcPr>
-            <w:tcW w:type="dxa" w:w="5040"/>
-            <w:vAlign w:val="center"/>
-          </w:tcPr>
-          <w:p>
-            <w:r>
-              <w:rPr>
-                <w:sz w:val="20"/>
-              </w:rPr>
-            </w:r>
-            <w:r>
-              <w:rPr>
-                <w:b w:val="0"/>
-                <w:sz w:val="20"/>
-              </w:rPr>
-              <w:t>TBD</w:t>
-            </w:r>
-          </w:p>
-        </w:tc>
-      </w:tr>
-    </w:tbl>
-    <w:p/>
     <w:sectPr>
       <w:footerReference w:type="default" r:id="rId9"/>
       <w:pgSz w:w="12240" w:h="15840"/>
@@ -3229,7 +2427,7 @@
       <w:jc w:val="center"/>
     </w:pPr>
     <w:r>
-      <w:t>Ride Booking System — System Design &amp; Team Coordination</w:t>
+      <w:t>Ride Booking Server — System Design</w:t>
     </w:r>
   </w:p>
 </w:ftr>
@@ -3662,7 +2860,7 @@
       <w:outlineLvl w:val="0"/>
     </w:pPr>
     <w:rPr>
-      <w:rFonts w:asciiTheme="majorHAnsi" w:eastAsiaTheme="majorEastAsia" w:hAnsiTheme="majorHAnsi" w:cstheme="majorBidi" w:ascii="Aptos Display" w:hAnsi="Aptos Display"/>
+      <w:rFonts w:asciiTheme="majorHAnsi" w:eastAsiaTheme="majorEastAsia" w:hAnsiTheme="majorHAnsi" w:cstheme="majorBidi" w:ascii="Aptos" w:hAnsi="Aptos"/>
       <w:b/>
       <w:bCs/>
       <w:color w:val="365F91" w:themeColor="accent1" w:themeShade="BF"/>
@@ -3686,7 +2884,7 @@
       <w:outlineLvl w:val="1"/>
     </w:pPr>
     <w:rPr>
-      <w:rFonts w:asciiTheme="majorHAnsi" w:eastAsiaTheme="majorEastAsia" w:hAnsiTheme="majorHAnsi" w:cstheme="majorBidi" w:ascii="Aptos Display" w:hAnsi="Aptos Display"/>
+      <w:rFonts w:asciiTheme="majorHAnsi" w:eastAsiaTheme="majorEastAsia" w:hAnsiTheme="majorHAnsi" w:cstheme="majorBidi" w:ascii="Aptos" w:hAnsi="Aptos"/>
       <w:b/>
       <w:bCs/>
       <w:color w:val="4F81BD" w:themeColor="accent1"/>
@@ -3710,7 +2908,7 @@
       <w:outlineLvl w:val="2"/>
     </w:pPr>
     <w:rPr>
-      <w:rFonts w:asciiTheme="majorHAnsi" w:eastAsiaTheme="majorEastAsia" w:hAnsiTheme="majorHAnsi" w:cstheme="majorBidi" w:ascii="Aptos Display" w:hAnsi="Aptos Display"/>
+      <w:rFonts w:asciiTheme="majorHAnsi" w:eastAsiaTheme="majorEastAsia" w:hAnsiTheme="majorHAnsi" w:cstheme="majorBidi" w:ascii="Aptos" w:hAnsi="Aptos"/>
       <w:b/>
       <w:bCs/>
       <w:color w:val="4F81BD" w:themeColor="accent1"/>

</xml_diff>